<commit_message>
print the acm url for the www 2026 entry, and check citations resolve by identifier
ACM has not registered 10.1145/3774904.3792675 with the resolver, so doi.org
returns 404 while the publisher page resolves. one_identifier prefers a DOI
over a URL, so the entry was printing the address that fails. The DOI is
recorded as a comment in the entry and the URL carries it in its path.

The wider problem behind the Zhang 2023 mis-citation was that 37 citations
matched their entry on nothing but an author-year label, because the entries
record the venue page in `url` and the arXiv id only inside `note`, which
entry_links never read. It reads it now, which takes those 37 to 2; both were
verified by hand against arXiv and their ids recorded, which takes it to 0.

check_citemap gains that as a third check, so a citation whose link matches no
identifier in the bibliography fails the build rather than resolving on a label
that fits any work by those authors in that year.
</commit_message>
<xml_diff>
--- a/papers/01-evidence-audit/from-synchronization-physics-to-trained-dynamics.docx
+++ b/papers/01-evidence-audit/from-synchronization-physics-to-trained-dynamics.docx
@@ -15098,13 +15098,13 @@
               </w:rPr>
               <w:t xml:space="preserve">(</w:t>
             </w:r>
-            <w:hyperlink w:anchor="ref-rusch2021">
+            <w:hyperlink w:anchor="ref-unicornn">
               <w:r>
                 <w:rPr>
                   <w:rStyle w:val="Hyperlink"/>
                   <w:lang w:val="en-GB"/>
                 </w:rPr>
-                <w:t xml:space="preserve">Rusch &amp; Mishra, 2021a</w:t>
+                <w:t xml:space="preserve">Rusch &amp; Mishra, 2021b</w:t>
               </w:r>
             </w:hyperlink>
             <w:r>
@@ -27205,7 +27205,7 @@
             <w:rStyle w:val="Hyperlink"/>
             <w:lang w:val="en-GB"/>
           </w:rPr>
-          <w:t xml:space="preserve">https://doi.org/10.1145/3774904.3792675</w:t>
+          <w:t xml:space="preserve">https://dl.acm.org/doi/10.1145/3774904.3792675</w:t>
         </w:r>
       </w:hyperlink>
     </w:p>

</xml_diff>

<commit_message>
cite the frequency-learning study, and give its scale instead of judging it
The claim about half of randomly initialized runs failing carried no citation
at all. It is Ahmadi (2026), arXiv:2604.10272, already in the bibliography and
cited twice elsewhere but not here.

Two corrections to the sentence while attaching it. It called that study the
one making natural frequencies first-class learnable parameters, which our own
Appendix D contradicts: Un-0 trains coupling and frequencies together. What is
actually unique to Ahmadi is isolating frequency learning as a variable, an
omega-only against K-only comparison, so the claim now says that.

And "toy scale" was a judgement standing in for a fact the reader can weigh:
nine oscillators, seven learnable frequencies, two vowels. The paper says as
much itself. "loss-landscape multistability" is now its own phrase too.
</commit_message>
<xml_diff>
--- a/papers/01-evidence-audit/from-synchronization-physics-to-trained-dynamics.docx
+++ b/papers/01-evidence-audit/from-synchronization-physics-to-trained-dynamics.docx
@@ -8237,114 +8237,6 @@
     </w:p>
     <w:p>
       <w:pPr>
-        <w:pStyle w:val="BodyText"/>
-      </w:pPr>
-      <w:r>
-        <w:rPr>
-          <w:b/>
-          <w:bCs/>
-          <w:lang w:val="en-GB"/>
-        </w:rPr>
-        <w:t xml:space="preserve">What is comparable.</w:t>
-      </w:r>
-      <w:r>
-        <w:rPr>
-          <w:lang w:val="en-GB"/>
-        </w:rPr>
-        <w:t xml:space="preserve"> </w:t>
-      </w:r>
-      <w:r>
-        <w:rPr>
-          <w:lang w:val="en-GB"/>
-        </w:rPr>
-        <w:t xml:space="preserve">Two kinds of comparison survive those limits. A paper’s own ablations are protocol-matched by construction, so the controls table below compares like with like even where nothing else in the record does. And parameter budget carries across papers wherever it is reported, which is what makes the matched-budget external baselines, rare but present, worth reading closely.</w:t>
-      </w:r>
-    </w:p>
-    <w:p>
-      <w:pPr>
-        <w:pStyle w:val="BodyText"/>
-      </w:pPr>
-      <w:r>
-        <w:rPr>
-          <w:lang w:val="en-GB"/>
-        </w:rPr>
-        <w:t xml:space="preserve">Training horizon is comparable in the same way and shows a conspicuous pattern. Un-0 trains with 10 to 25 integration steps and reports no stability machinery of any kind; WONN unrolls 18 steps, six layers of three; Kuramoto Attention takes one dynamics step per layer; Kuramoto Orientation Diffusion never trains a long chain at all. The oscillator systems that do handle long horizons changed the problem rather than solving it: coRNN and UnICORNN prove gradient bounds from damping first, LinOSS makes the dynamics linear, D-LinOSS keeps every mode contractive by construction. Theory tracks the same line, with generalization bounds growing linearly in horizon and approximation rates requiring incremental stability. Meanwhile a parallel literature develops training rules that avoid backpropagation through the dynamics entirely: equilibrium propagation for Kuramoto frequencies</w:t>
-      </w:r>
-      <w:r>
-        <w:rPr>
-          <w:lang w:val="en-GB"/>
-        </w:rPr>
-        <w:t xml:space="preserve"> </w:t>
-      </w:r>
-      <w:r>
-        <w:rPr>
-          <w:lang w:val="en-GB"/>
-        </w:rPr>
-        <w:t xml:space="preserve">(</w:t>
-      </w:r>
-      <w:hyperlink w:anchor="ref-ahmadi2026">
-        <w:r>
-          <w:rPr>
-            <w:rStyle w:val="Hyperlink"/>
-            <w:lang w:val="en-GB"/>
-          </w:rPr>
-          <w:t xml:space="preserve">Ahmadi, 2026</w:t>
-        </w:r>
-      </w:hyperlink>
-      <w:r>
-        <w:rPr>
-          <w:lang w:val="en-GB"/>
-        </w:rPr>
-        <w:t xml:space="preserve">)</w:t>
-      </w:r>
-      <w:r>
-        <w:rPr>
-          <w:lang w:val="en-GB"/>
-        </w:rPr>
-        <w:t xml:space="preserve"> </w:t>
-      </w:r>
-      <w:r>
-        <w:rPr>
-          <w:lang w:val="en-GB"/>
-        </w:rPr>
-        <w:t xml:space="preserve">and local force-measurement rules for driven nonlinear oscillators</w:t>
-      </w:r>
-      <w:r>
-        <w:rPr>
-          <w:lang w:val="en-GB"/>
-        </w:rPr>
-        <w:t xml:space="preserve"> </w:t>
-      </w:r>
-      <w:r>
-        <w:rPr>
-          <w:lang w:val="en-GB"/>
-        </w:rPr>
-        <w:t xml:space="preserve">(</w:t>
-      </w:r>
-      <w:hyperlink w:anchor="ref-bosch2025">
-        <w:r>
-          <w:rPr>
-            <w:rStyle w:val="Hyperlink"/>
-            <w:lang w:val="en-GB"/>
-          </w:rPr>
-          <w:t xml:space="preserve">Bösch et al., 2025</w:t>
-        </w:r>
-      </w:hyperlink>
-      <w:r>
-        <w:rPr>
-          <w:lang w:val="en-GB"/>
-        </w:rPr>
-        <w:t xml:space="preserve">)</w:t>
-      </w:r>
-      <w:r>
-        <w:rPr>
-          <w:lang w:val="en-GB"/>
-        </w:rPr>
-        <w:t xml:space="preserve">.</w:t>
-      </w:r>
-    </w:p>
-    <w:p>
-      <w:pPr>
         <w:pStyle w:val="CaptionedFigure"/>
       </w:pPr>
       <w:r>
@@ -8401,6 +8293,114 @@
         <w:t xml:space="preserve">Figure 12. Steps unrolled and backpropagated through, by system. Filled markers are nonlinear dynamics with no stated gradient bound; open markers are linear dynamics, or gradients bounded by dissipation. coRNN and UnICORNN are not plotted: they train long sequences, but prove gradient bounds from damping before doing so. Every nonlinear system sits at the short end, and the one system three orders of magnitude out is linear.</w:t>
       </w:r>
     </w:p>
+    <w:p>
+      <w:pPr>
+        <w:pStyle w:val="BodyText"/>
+      </w:pPr>
+      <w:r>
+        <w:rPr>
+          <w:b/>
+          <w:bCs/>
+          <w:lang w:val="en-GB"/>
+        </w:rPr>
+        <w:t xml:space="preserve">What is comparable.</w:t>
+      </w:r>
+      <w:r>
+        <w:rPr>
+          <w:lang w:val="en-GB"/>
+        </w:rPr>
+        <w:t xml:space="preserve"> </w:t>
+      </w:r>
+      <w:r>
+        <w:rPr>
+          <w:lang w:val="en-GB"/>
+        </w:rPr>
+        <w:t xml:space="preserve">Two kinds of comparison survive those limits. A paper’s own ablations are protocol-matched by construction, so the controls table below compares like with like even where nothing else in the record does. And parameter budget carries across papers wherever it is reported, which is what makes the matched-budget external baselines, rare but present, worth reading closely.</w:t>
+      </w:r>
+    </w:p>
+    <w:p>
+      <w:pPr>
+        <w:pStyle w:val="BodyText"/>
+      </w:pPr>
+      <w:r>
+        <w:rPr>
+          <w:lang w:val="en-GB"/>
+        </w:rPr>
+        <w:t xml:space="preserve">Training horizon is comparable in the same way and shows a conspicuous pattern. Un-0 trains with 10 to 25 integration steps and reports no stability machinery of any kind; WONN unrolls 18 steps, six layers of three; Kuramoto Attention takes one dynamics step per layer; Kuramoto Orientation Diffusion never trains a long chain at all. The oscillator systems that do handle long horizons changed the problem rather than solving it: coRNN and UnICORNN prove gradient bounds from damping first, LinOSS makes the dynamics linear, D-LinOSS keeps every mode contractive by construction. Theory tracks the same line, with generalization bounds growing linearly in horizon and approximation rates requiring incremental stability. Meanwhile a parallel literature develops training rules that avoid backpropagation through the dynamics entirely: equilibrium propagation for Kuramoto frequencies</w:t>
+      </w:r>
+      <w:r>
+        <w:rPr>
+          <w:lang w:val="en-GB"/>
+        </w:rPr>
+        <w:t xml:space="preserve"> </w:t>
+      </w:r>
+      <w:r>
+        <w:rPr>
+          <w:lang w:val="en-GB"/>
+        </w:rPr>
+        <w:t xml:space="preserve">(</w:t>
+      </w:r>
+      <w:hyperlink w:anchor="ref-ahmadi2026">
+        <w:r>
+          <w:rPr>
+            <w:rStyle w:val="Hyperlink"/>
+            <w:lang w:val="en-GB"/>
+          </w:rPr>
+          <w:t xml:space="preserve">Ahmadi, 2026</w:t>
+        </w:r>
+      </w:hyperlink>
+      <w:r>
+        <w:rPr>
+          <w:lang w:val="en-GB"/>
+        </w:rPr>
+        <w:t xml:space="preserve">)</w:t>
+      </w:r>
+      <w:r>
+        <w:rPr>
+          <w:lang w:val="en-GB"/>
+        </w:rPr>
+        <w:t xml:space="preserve"> </w:t>
+      </w:r>
+      <w:r>
+        <w:rPr>
+          <w:lang w:val="en-GB"/>
+        </w:rPr>
+        <w:t xml:space="preserve">and local force-measurement rules for driven nonlinear oscillators</w:t>
+      </w:r>
+      <w:r>
+        <w:rPr>
+          <w:lang w:val="en-GB"/>
+        </w:rPr>
+        <w:t xml:space="preserve"> </w:t>
+      </w:r>
+      <w:r>
+        <w:rPr>
+          <w:lang w:val="en-GB"/>
+        </w:rPr>
+        <w:t xml:space="preserve">(</w:t>
+      </w:r>
+      <w:hyperlink w:anchor="ref-bosch2025">
+        <w:r>
+          <w:rPr>
+            <w:rStyle w:val="Hyperlink"/>
+            <w:lang w:val="en-GB"/>
+          </w:rPr>
+          <w:t xml:space="preserve">Bösch et al., 2025</w:t>
+        </w:r>
+      </w:hyperlink>
+      <w:r>
+        <w:rPr>
+          <w:lang w:val="en-GB"/>
+        </w:rPr>
+        <w:t xml:space="preserve">)</w:t>
+      </w:r>
+      <w:r>
+        <w:rPr>
+          <w:lang w:val="en-GB"/>
+        </w:rPr>
+        <w:t xml:space="preserve">.</w:t>
+      </w:r>
+    </w:p>
     <w:bookmarkEnd w:id="62"/>
     <w:bookmarkStart w:id="63" w:name="what-the-systems-report-as-controls"/>
     <w:p>
@@ -10884,7 +10884,46 @@
         <w:rPr>
           <w:lang w:val="en-GB"/>
         </w:rPr>
-        <w:t xml:space="preserve">). In Kuramoto networks specifically, the one study making natural frequencies first-class learnable parameters reports roughly half of randomly initialized runs failing through landscape multistability, rescued by designed spectral seeding (toy scale, preprint). And where oscillator systems succeed with</w:t>
+        <w:t xml:space="preserve">). In Kuramoto networks specifically, the one study to train natural frequencies as a parameter in their own right rather than jointly with coupling</w:t>
+      </w:r>
+      <w:r>
+        <w:rPr>
+          <w:lang w:val="en-GB"/>
+        </w:rPr>
+        <w:t xml:space="preserve"> </w:t>
+      </w:r>
+      <w:r>
+        <w:rPr>
+          <w:lang w:val="en-GB"/>
+        </w:rPr>
+        <w:t xml:space="preserve">(</w:t>
+      </w:r>
+      <w:hyperlink w:anchor="ref-ahmadi2026">
+        <w:r>
+          <w:rPr>
+            <w:rStyle w:val="Hyperlink"/>
+            <w:lang w:val="en-GB"/>
+          </w:rPr>
+          <w:t xml:space="preserve">Ahmadi, 2026</w:t>
+        </w:r>
+      </w:hyperlink>
+      <w:r>
+        <w:rPr>
+          <w:lang w:val="en-GB"/>
+        </w:rPr>
+        <w:t xml:space="preserve">)</w:t>
+      </w:r>
+      <w:r>
+        <w:rPr>
+          <w:lang w:val="en-GB"/>
+        </w:rPr>
+        <w:t xml:space="preserve"> </w:t>
+      </w:r>
+      <w:r>
+        <w:rPr>
+          <w:lang w:val="en-GB"/>
+        </w:rPr>
+        <w:t xml:space="preserve">reports roughly half of randomly initialized runs failing through loss-landscape multistability, rescued by seeding the frequencies from the eigenvectors of the coupling Laplacian, on a nine-oscillator network with seven learnable frequencies separating two vowels (preprint). And where oscillator systems succeed with</w:t>
       </w:r>
       <w:r>
         <w:rPr>

</xml_diff>

<commit_message>
cite the metronome demonstration, name the speech review, fix a comma splice
A sweep of the body for empirical claims that resolve to no citation. Most of
what it surfaced was fine: the theory claims in Sections 2.3.2 and 3.1.4 refer
back to the universality result cited in 2.2.5, which is ordinary practice.

Three were not. A stray comma split subject from verb in the Huygens sentence.
The clause after it said the observation was explained by the Kuramoto coupling
function "and the famous experiment demonstrating multiple metronomes ...
synchronizing", which is ungrammatical, since an experiment explains nothing,
and cited no source for a specific demonstration; it now reads as a
demonstration of the same locking and cites Pantaleone (2002). And the
conclusion referred to "the review that sets three speech models against each
other" fifty-six paragraphs after the only mention of it; it now names
Dogonasheva et al. (2026).

The bibliography is 129 entries, and both READMEs say so.
</commit_message>
<xml_diff>
--- a/papers/01-evidence-audit/from-synchronization-physics-to-trained-dynamics.docx
+++ b/papers/01-evidence-audit/from-synchronization-physics-to-trained-dynamics.docx
@@ -1026,7 +1026,7 @@
         <w:rPr>
           <w:lang w:val="en-GB"/>
         </w:rPr>
-        <w:t xml:space="preserve">The observed coupling of oscillators has been on record since 1665, when Christiaan Huygens, found that two pendulum clocks hung from the same wooden beam settled into antiphase within about thirty minutes and resynchronized when disturbed (later published in 1673). Huygens attributed this to motion too small to see, transmitted through the wood beam they shared. The prehistory of the self-sustained oscillator runs from Airy’s first mathematical treatment in 1830 through Poincaré’s limit cycle and Blondel’s naming of the phenomenon, a lineage traced in full by</w:t>
+        <w:t xml:space="preserve">The observed coupling of oscillators has been on record since 1665, when Christiaan Huygens found that two pendulum clocks hung from the same wooden beam settled into antiphase within about thirty minutes and resynchronized when disturbed (later published in 1673). Huygens attributed this to motion too small to see, transmitted through the wood beam they shared. The prehistory of the self-sustained oscillator runs from Airy’s first mathematical treatment in 1830 through Poincaré’s limit cycle and Blondel’s naming of the phenomenon, a lineage traced in full by</w:t>
       </w:r>
       <w:r>
         <w:rPr>
@@ -1059,7 +1059,7 @@
         <w:rPr>
           <w:lang w:val="en-GB"/>
         </w:rPr>
-        <w:t xml:space="preserve">, whose survey of self-oscillatory devices for unconventional computing covers similar background as this paper, but from the materials and neuromorphic hardware angle. Fast forward a few hundred years: Huygens’ observation was mathematically explained by the Kuramoto coupling function</w:t>
+        <w:t xml:space="preserve">, whose survey of self-oscillatory devices for unconventional computing covers similar background as this paper, but from the materials and neuromorphic hardware angle. Fast forward a few hundred years: Huygens’ observation was given its mathematical form by the Kuramoto coupling function</w:t>
       </w:r>
       <w:r>
         <w:rPr>
@@ -1092,13 +1092,40 @@
         <w:rPr>
           <w:lang w:val="en-GB"/>
         </w:rPr>
-        <w:t xml:space="preserve"> </w:t>
-      </w:r>
-      <w:r>
-        <w:rPr>
-          <w:lang w:val="en-GB"/>
-        </w:rPr>
-        <w:t xml:space="preserve">and the famous experiment demonstrating multiple metronomes on a moving surface, started at different times, synchronizing. Huygens’ experiments were later replicated and explained by</w:t>
+        <w:t xml:space="preserve">, and the same locking is what a row of metronomes started at different times on a shared moving platform demonstrates</w:t>
+      </w:r>
+      <w:r>
+        <w:rPr>
+          <w:lang w:val="en-GB"/>
+        </w:rPr>
+        <w:t xml:space="preserve"> </w:t>
+      </w:r>
+      <w:r>
+        <w:rPr>
+          <w:lang w:val="en-GB"/>
+        </w:rPr>
+        <w:t xml:space="preserve">(</w:t>
+      </w:r>
+      <w:hyperlink w:anchor="ref-pantaleone2002">
+        <w:r>
+          <w:rPr>
+            <w:rStyle w:val="Hyperlink"/>
+            <w:lang w:val="en-GB"/>
+          </w:rPr>
+          <w:t xml:space="preserve">Pantaleone, 2002</w:t>
+        </w:r>
+      </w:hyperlink>
+      <w:r>
+        <w:rPr>
+          <w:lang w:val="en-GB"/>
+        </w:rPr>
+        <w:t xml:space="preserve">)</w:t>
+      </w:r>
+      <w:r>
+        <w:rPr>
+          <w:lang w:val="en-GB"/>
+        </w:rPr>
+        <w:t xml:space="preserve">. Huygens’ experiments were later replicated and explained by</w:t>
       </w:r>
       <w:r>
         <w:rPr>
@@ -12320,7 +12347,46 @@
         <w:rPr>
           <w:lang w:val="en-GB"/>
         </w:rPr>
-        <w:t xml:space="preserve">Three further gaps sit alongside that one, and Section 3.1 sets out the evidence for each. We found no scaling study for trained oscillator networks, so how these systems behave as they grow is unknown. No surveyed system has published a measured energy win, which leaves the field’s most-cited motivation resting on adjacent substrates. And the physics in use stops short of the forms that would test the properties these papers say they want: partial coherence on structured supports, the many coexisting stable states that higher-order and simplicial coupling produce, and the phase-position coupling of swarmalators. The neuroscience shows the same attribution problem from the other side, and the review that sets three speech models against each other reaches it independently.</w:t>
+        <w:t xml:space="preserve">Three further gaps sit alongside that one, and Section 3.1 sets out the evidence for each. We found no scaling study for trained oscillator networks, so how these systems behave as they grow is unknown. No surveyed system has published a measured energy win, which leaves the field’s most-cited motivation resting on adjacent substrates. And the physics in use stops short of the forms that would test the properties these papers say they want: partial coherence on structured supports, the many coexisting stable states that higher-order and simplicial coupling produce, and the phase-position coupling of swarmalators. The neuroscience shows the same attribution problem from the other side, and the review that sets three theta-rhythmic segmentation models against each other</w:t>
+      </w:r>
+      <w:r>
+        <w:rPr>
+          <w:lang w:val="en-GB"/>
+        </w:rPr>
+        <w:t xml:space="preserve"> </w:t>
+      </w:r>
+      <w:r>
+        <w:rPr>
+          <w:lang w:val="en-GB"/>
+        </w:rPr>
+        <w:t xml:space="preserve">(</w:t>
+      </w:r>
+      <w:hyperlink w:anchor="ref-dogonasheva2026">
+        <w:r>
+          <w:rPr>
+            <w:rStyle w:val="Hyperlink"/>
+            <w:lang w:val="en-GB"/>
+          </w:rPr>
+          <w:t xml:space="preserve">Dogonasheva et al., 2026</w:t>
+        </w:r>
+      </w:hyperlink>
+      <w:r>
+        <w:rPr>
+          <w:lang w:val="en-GB"/>
+        </w:rPr>
+        <w:t xml:space="preserve">)</w:t>
+      </w:r>
+      <w:r>
+        <w:rPr>
+          <w:lang w:val="en-GB"/>
+        </w:rPr>
+        <w:t xml:space="preserve"> </w:t>
+      </w:r>
+      <w:r>
+        <w:rPr>
+          <w:lang w:val="en-GB"/>
+        </w:rPr>
+        <w:t xml:space="preserve">reaches it independently.</w:t>
       </w:r>
     </w:p>
     <w:p>
@@ -18218,7 +18284,7 @@
       </w:r>
     </w:p>
     <w:bookmarkEnd w:id="86"/>
-    <w:bookmarkStart w:id="344" w:name="g-questions-the-record-leaves-open"/>
+    <w:bookmarkStart w:id="346" w:name="g-questions-the-record-leaves-open"/>
     <w:p>
       <w:pPr>
         <w:pStyle w:val="Heading1"/>
@@ -18598,7 +18664,7 @@
         <w:t xml:space="preserve">References</w:t>
       </w:r>
     </w:p>
-    <w:bookmarkStart w:id="343" w:name="refs"/>
+    <w:bookmarkStart w:id="345" w:name="refs"/>
     <w:bookmarkStart w:id="88" w:name="ref-abrams2004"/>
     <w:p>
       <w:pPr>
@@ -24553,7 +24619,7 @@
       </w:hyperlink>
     </w:p>
     <w:bookmarkEnd w:id="260"/>
-    <w:bookmarkStart w:id="262" w:name="ref-pikovsky2001"/>
+    <w:bookmarkStart w:id="262" w:name="ref-pantaleone2002"/>
     <w:p>
       <w:pPr>
         <w:pStyle w:val="Bibliography"/>
@@ -24562,6 +24628,74 @@
         <w:rPr>
           <w:lang w:val="en-GB"/>
         </w:rPr>
+        <w:t xml:space="preserve">Pantaleone, J. (2002). Synchronization of metronomes.</w:t>
+      </w:r>
+      <w:r>
+        <w:rPr>
+          <w:lang w:val="en-GB"/>
+        </w:rPr>
+        <w:t xml:space="preserve"> </w:t>
+      </w:r>
+      <w:r>
+        <w:rPr>
+          <w:i/>
+          <w:iCs/>
+          <w:lang w:val="en-GB"/>
+        </w:rPr>
+        <w:t xml:space="preserve">American Journal of Physics</w:t>
+      </w:r>
+      <w:r>
+        <w:rPr>
+          <w:lang w:val="en-GB"/>
+        </w:rPr>
+        <w:t xml:space="preserve">,</w:t>
+      </w:r>
+      <w:r>
+        <w:rPr>
+          <w:lang w:val="en-GB"/>
+        </w:rPr>
+        <w:t xml:space="preserve"> </w:t>
+      </w:r>
+      <w:r>
+        <w:rPr>
+          <w:i/>
+          <w:iCs/>
+          <w:lang w:val="en-GB"/>
+        </w:rPr>
+        <w:t xml:space="preserve">70</w:t>
+      </w:r>
+      <w:r>
+        <w:rPr>
+          <w:lang w:val="en-GB"/>
+        </w:rPr>
+        <w:t xml:space="preserve">(10), 992–1000.</w:t>
+      </w:r>
+      <w:r>
+        <w:rPr>
+          <w:lang w:val="en-GB"/>
+        </w:rPr>
+        <w:t xml:space="preserve"> </w:t>
+      </w:r>
+      <w:hyperlink r:id="rId261">
+        <w:r>
+          <w:rPr>
+            <w:rStyle w:val="Hyperlink"/>
+            <w:lang w:val="en-GB"/>
+          </w:rPr>
+          <w:t xml:space="preserve">https://doi.org/10.1119/1.1501118</w:t>
+        </w:r>
+      </w:hyperlink>
+    </w:p>
+    <w:bookmarkEnd w:id="262"/>
+    <w:bookmarkStart w:id="264" w:name="ref-pikovsky2001"/>
+    <w:p>
+      <w:pPr>
+        <w:pStyle w:val="Bibliography"/>
+      </w:pPr>
+      <w:r>
+        <w:rPr>
+          <w:lang w:val="en-GB"/>
+        </w:rPr>
         <w:t xml:space="preserve">Pikovsky, A., Rosenblum, M., &amp; Kurths, J. (2001).</w:t>
       </w:r>
       <w:r>
@@ -24590,7 +24724,7 @@
         </w:rPr>
         <w:t xml:space="preserve"> </w:t>
       </w:r>
-      <w:hyperlink r:id="rId261">
+      <w:hyperlink r:id="rId263">
         <w:r>
           <w:rPr>
             <w:rStyle w:val="Hyperlink"/>
@@ -24600,8 +24734,8 @@
         </w:r>
       </w:hyperlink>
     </w:p>
-    <w:bookmarkEnd w:id="262"/>
-    <w:bookmarkStart w:id="264" w:name="ref-pittman-polletta2021"/>
+    <w:bookmarkEnd w:id="264"/>
+    <w:bookmarkStart w:id="266" w:name="ref-pittman-polletta2021"/>
     <w:p>
       <w:pPr>
         <w:pStyle w:val="Bibliography"/>
@@ -24658,7 +24792,7 @@
         </w:rPr>
         <w:t xml:space="preserve"> </w:t>
       </w:r>
-      <w:hyperlink r:id="rId263">
+      <w:hyperlink r:id="rId265">
         <w:r>
           <w:rPr>
             <w:rStyle w:val="Hyperlink"/>
@@ -24668,8 +24802,8 @@
         </w:r>
       </w:hyperlink>
     </w:p>
-    <w:bookmarkEnd w:id="264"/>
-    <w:bookmarkStart w:id="266" w:name="ref-poppel2026"/>
+    <w:bookmarkEnd w:id="266"/>
+    <w:bookmarkStart w:id="268" w:name="ref-poppel2026"/>
     <w:p>
       <w:pPr>
         <w:pStyle w:val="Bibliography"/>
@@ -24706,7 +24840,7 @@
         </w:rPr>
         <w:t xml:space="preserve"> </w:t>
       </w:r>
-      <w:hyperlink r:id="rId265">
+      <w:hyperlink r:id="rId267">
         <w:r>
           <w:rPr>
             <w:rStyle w:val="Hyperlink"/>
@@ -24716,8 +24850,8 @@
         </w:r>
       </w:hyperlink>
     </w:p>
-    <w:bookmarkEnd w:id="266"/>
-    <w:bookmarkStart w:id="268" w:name="ref-rivera-sierra2026"/>
+    <w:bookmarkEnd w:id="268"/>
+    <w:bookmarkStart w:id="270" w:name="ref-rivera-sierra2026"/>
     <w:p>
       <w:pPr>
         <w:pStyle w:val="Bibliography"/>
@@ -24774,7 +24908,7 @@
         </w:rPr>
         <w:t xml:space="preserve"> </w:t>
       </w:r>
-      <w:hyperlink r:id="rId267">
+      <w:hyperlink r:id="rId269">
         <w:r>
           <w:rPr>
             <w:rStyle w:val="Hyperlink"/>
@@ -24784,8 +24918,8 @@
         </w:r>
       </w:hyperlink>
     </w:p>
-    <w:bookmarkEnd w:id="268"/>
-    <w:bookmarkStart w:id="270" w:name="ref-rodan2011"/>
+    <w:bookmarkEnd w:id="270"/>
+    <w:bookmarkStart w:id="272" w:name="ref-rodan2011"/>
     <w:p>
       <w:pPr>
         <w:pStyle w:val="Bibliography"/>
@@ -24842,7 +24976,7 @@
         </w:rPr>
         <w:t xml:space="preserve"> </w:t>
       </w:r>
-      <w:hyperlink r:id="rId269">
+      <w:hyperlink r:id="rId271">
         <w:r>
           <w:rPr>
             <w:rStyle w:val="Hyperlink"/>
@@ -24852,8 +24986,8 @@
         </w:r>
       </w:hyperlink>
     </w:p>
-    <w:bookmarkEnd w:id="270"/>
-    <w:bookmarkStart w:id="272" w:name="ref-rusch2021"/>
+    <w:bookmarkEnd w:id="272"/>
+    <w:bookmarkStart w:id="274" w:name="ref-rusch2021"/>
     <w:p>
       <w:pPr>
         <w:pStyle w:val="Bibliography"/>
@@ -24922,7 +25056,7 @@
         </w:rPr>
         <w:t xml:space="preserve"> </w:t>
       </w:r>
-      <w:hyperlink r:id="rId271">
+      <w:hyperlink r:id="rId273">
         <w:r>
           <w:rPr>
             <w:rStyle w:val="Hyperlink"/>
@@ -24932,8 +25066,8 @@
         </w:r>
       </w:hyperlink>
     </w:p>
-    <w:bookmarkEnd w:id="272"/>
-    <w:bookmarkStart w:id="274" w:name="ref-unicornn"/>
+    <w:bookmarkEnd w:id="274"/>
+    <w:bookmarkStart w:id="276" w:name="ref-unicornn"/>
     <w:p>
       <w:pPr>
         <w:pStyle w:val="Bibliography"/>
@@ -25022,7 +25156,7 @@
         </w:rPr>
         <w:t xml:space="preserve"> </w:t>
       </w:r>
-      <w:hyperlink r:id="rId273">
+      <w:hyperlink r:id="rId275">
         <w:r>
           <w:rPr>
             <w:rStyle w:val="Hyperlink"/>
@@ -25032,8 +25166,8 @@
         </w:r>
       </w:hyperlink>
     </w:p>
-    <w:bookmarkEnd w:id="274"/>
-    <w:bookmarkStart w:id="276" w:name="ref-rusch2025"/>
+    <w:bookmarkEnd w:id="276"/>
+    <w:bookmarkStart w:id="278" w:name="ref-rusch2025"/>
     <w:p>
       <w:pPr>
         <w:pStyle w:val="Bibliography"/>
@@ -25102,7 +25236,7 @@
         </w:rPr>
         <w:t xml:space="preserve"> </w:t>
       </w:r>
-      <w:hyperlink r:id="rId275">
+      <w:hyperlink r:id="rId277">
         <w:r>
           <w:rPr>
             <w:rStyle w:val="Hyperlink"/>
@@ -25112,8 +25246,8 @@
         </w:r>
       </w:hyperlink>
     </w:p>
-    <w:bookmarkEnd w:id="276"/>
-    <w:bookmarkStart w:id="278" w:name="ref-sagodi"/>
+    <w:bookmarkEnd w:id="278"/>
+    <w:bookmarkStart w:id="280" w:name="ref-sagodi"/>
     <w:p>
       <w:pPr>
         <w:pStyle w:val="Bibliography"/>
@@ -25150,7 +25284,7 @@
         </w:rPr>
         <w:t xml:space="preserve"> </w:t>
       </w:r>
-      <w:hyperlink r:id="rId277">
+      <w:hyperlink r:id="rId279">
         <w:r>
           <w:rPr>
             <w:rStyle w:val="Hyperlink"/>
@@ -25160,8 +25294,8 @@
         </w:r>
       </w:hyperlink>
     </w:p>
-    <w:bookmarkEnd w:id="278"/>
-    <w:bookmarkStart w:id="280" w:name="ref-sajjadi2018"/>
+    <w:bookmarkEnd w:id="280"/>
+    <w:bookmarkStart w:id="282" w:name="ref-sajjadi2018"/>
     <w:p>
       <w:pPr>
         <w:pStyle w:val="Bibliography"/>
@@ -25230,7 +25364,7 @@
         </w:rPr>
         <w:t xml:space="preserve"> </w:t>
       </w:r>
-      <w:hyperlink r:id="rId279">
+      <w:hyperlink r:id="rId281">
         <w:r>
           <w:rPr>
             <w:rStyle w:val="Hyperlink"/>
@@ -25240,8 +25374,8 @@
         </w:r>
       </w:hyperlink>
     </w:p>
-    <w:bookmarkEnd w:id="280"/>
-    <w:bookmarkStart w:id="282" w:name="ref-sakaguchi1986"/>
+    <w:bookmarkEnd w:id="282"/>
+    <w:bookmarkStart w:id="284" w:name="ref-sakaguchi1986"/>
     <w:p>
       <w:pPr>
         <w:pStyle w:val="Bibliography"/>
@@ -25298,7 +25432,7 @@
         </w:rPr>
         <w:t xml:space="preserve"> </w:t>
       </w:r>
-      <w:hyperlink r:id="rId281">
+      <w:hyperlink r:id="rId283">
         <w:r>
           <w:rPr>
             <w:rStyle w:val="Hyperlink"/>
@@ -25308,8 +25442,8 @@
         </w:r>
       </w:hyperlink>
     </w:p>
-    <w:bookmarkEnd w:id="282"/>
-    <w:bookmarkStart w:id="284" w:name="ref-sasikumar2026"/>
+    <w:bookmarkEnd w:id="284"/>
+    <w:bookmarkStart w:id="286" w:name="ref-sasikumar2026"/>
     <w:p>
       <w:pPr>
         <w:pStyle w:val="Bibliography"/>
@@ -25366,7 +25500,7 @@
         </w:rPr>
         <w:t xml:space="preserve"> </w:t>
       </w:r>
-      <w:hyperlink r:id="rId283">
+      <w:hyperlink r:id="rId285">
         <w:r>
           <w:rPr>
             <w:rStyle w:val="Hyperlink"/>
@@ -25376,8 +25510,8 @@
         </w:r>
       </w:hyperlink>
     </w:p>
-    <w:bookmarkEnd w:id="284"/>
-    <w:bookmarkStart w:id="286" w:name="ref-schuster1989"/>
+    <w:bookmarkEnd w:id="286"/>
+    <w:bookmarkStart w:id="288" w:name="ref-schuster1989"/>
     <w:p>
       <w:pPr>
         <w:pStyle w:val="Bibliography"/>
@@ -25434,7 +25568,7 @@
         </w:rPr>
         <w:t xml:space="preserve"> </w:t>
       </w:r>
-      <w:hyperlink r:id="rId285">
+      <w:hyperlink r:id="rId287">
         <w:r>
           <w:rPr>
             <w:rStyle w:val="Hyperlink"/>
@@ -25444,8 +25578,8 @@
         </w:r>
       </w:hyperlink>
     </w:p>
-    <w:bookmarkEnd w:id="286"/>
-    <w:bookmarkStart w:id="288" w:name="ref-skardal2019"/>
+    <w:bookmarkEnd w:id="288"/>
+    <w:bookmarkStart w:id="290" w:name="ref-skardal2019"/>
     <w:p>
       <w:pPr>
         <w:pStyle w:val="Bibliography"/>
@@ -25502,7 +25636,7 @@
         </w:rPr>
         <w:t xml:space="preserve"> </w:t>
       </w:r>
-      <w:hyperlink r:id="rId287">
+      <w:hyperlink r:id="rId289">
         <w:r>
           <w:rPr>
             <w:rStyle w:val="Hyperlink"/>
@@ -25512,8 +25646,8 @@
         </w:r>
       </w:hyperlink>
     </w:p>
-    <w:bookmarkEnd w:id="288"/>
-    <w:bookmarkStart w:id="290" w:name="ref-kuramoto-orientation-diffusion"/>
+    <w:bookmarkEnd w:id="290"/>
+    <w:bookmarkStart w:id="292" w:name="ref-kuramoto-orientation-diffusion"/>
     <w:p>
       <w:pPr>
         <w:pStyle w:val="Bibliography"/>
@@ -25582,7 +25716,7 @@
         </w:rPr>
         <w:t xml:space="preserve"> </w:t>
       </w:r>
-      <w:hyperlink r:id="rId289">
+      <w:hyperlink r:id="rId291">
         <w:r>
           <w:rPr>
             <w:rStyle w:val="Hyperlink"/>
@@ -25592,8 +25726,8 @@
         </w:r>
       </w:hyperlink>
     </w:p>
-    <w:bookmarkEnd w:id="290"/>
-    <w:bookmarkStart w:id="292" w:name="ref-stiefel2016"/>
+    <w:bookmarkEnd w:id="292"/>
+    <w:bookmarkStart w:id="294" w:name="ref-stiefel2016"/>
     <w:p>
       <w:pPr>
         <w:pStyle w:val="Bibliography"/>
@@ -25650,7 +25784,7 @@
         </w:rPr>
         <w:t xml:space="preserve"> </w:t>
       </w:r>
-      <w:hyperlink r:id="rId291">
+      <w:hyperlink r:id="rId293">
         <w:r>
           <w:rPr>
             <w:rStyle w:val="Hyperlink"/>
@@ -25660,8 +25794,8 @@
         </w:r>
       </w:hyperlink>
     </w:p>
-    <w:bookmarkEnd w:id="292"/>
-    <w:bookmarkStart w:id="294" w:name="ref-stolzle2024"/>
+    <w:bookmarkEnd w:id="294"/>
+    <w:bookmarkStart w:id="296" w:name="ref-stolzle2024"/>
     <w:p>
       <w:pPr>
         <w:pStyle w:val="Bibliography"/>
@@ -25730,7 +25864,7 @@
         </w:rPr>
         <w:t xml:space="preserve"> </w:t>
       </w:r>
-      <w:hyperlink r:id="rId293">
+      <w:hyperlink r:id="rId295">
         <w:r>
           <w:rPr>
             <w:rStyle w:val="Hyperlink"/>
@@ -25740,8 +25874,8 @@
         </w:r>
       </w:hyperlink>
     </w:p>
-    <w:bookmarkEnd w:id="294"/>
-    <w:bookmarkStart w:id="296" w:name="ref-strogatz2000"/>
+    <w:bookmarkEnd w:id="296"/>
+    <w:bookmarkStart w:id="298" w:name="ref-strogatz2000"/>
     <w:p>
       <w:pPr>
         <w:pStyle w:val="Bibliography"/>
@@ -25798,7 +25932,7 @@
         </w:rPr>
         <w:t xml:space="preserve"> </w:t>
       </w:r>
-      <w:hyperlink r:id="rId295">
+      <w:hyperlink r:id="rId297">
         <w:r>
           <w:rPr>
             <w:rStyle w:val="Hyperlink"/>
@@ -25808,8 +25942,8 @@
         </w:r>
       </w:hyperlink>
     </w:p>
-    <w:bookmarkEnd w:id="296"/>
-    <w:bookmarkStart w:id="298" w:name="ref-strogatz1993"/>
+    <w:bookmarkEnd w:id="298"/>
+    <w:bookmarkStart w:id="300" w:name="ref-strogatz1993"/>
     <w:p>
       <w:pPr>
         <w:pStyle w:val="Bibliography"/>
@@ -25866,7 +26000,7 @@
         </w:rPr>
         <w:t xml:space="preserve"> </w:t>
       </w:r>
-      <w:hyperlink r:id="rId297">
+      <w:hyperlink r:id="rId299">
         <w:r>
           <w:rPr>
             <w:rStyle w:val="Hyperlink"/>
@@ -25876,8 +26010,8 @@
         </w:r>
       </w:hyperlink>
     </w:p>
-    <w:bookmarkEnd w:id="298"/>
-    <w:bookmarkStart w:id="300" w:name="ref-stuart1960"/>
+    <w:bookmarkEnd w:id="300"/>
+    <w:bookmarkStart w:id="302" w:name="ref-stuart1960"/>
     <w:p>
       <w:pPr>
         <w:pStyle w:val="Bibliography"/>
@@ -25934,7 +26068,7 @@
         </w:rPr>
         <w:t xml:space="preserve"> </w:t>
       </w:r>
-      <w:hyperlink r:id="rId299">
+      <w:hyperlink r:id="rId301">
         <w:r>
           <w:rPr>
             <w:rStyle w:val="Hyperlink"/>
@@ -25944,8 +26078,8 @@
         </w:r>
       </w:hyperlink>
     </w:p>
-    <w:bookmarkEnd w:id="300"/>
-    <w:bookmarkStart w:id="302" w:name="ref-tanaka2019"/>
+    <w:bookmarkEnd w:id="302"/>
+    <w:bookmarkStart w:id="304" w:name="ref-tanaka2019"/>
     <w:p>
       <w:pPr>
         <w:pStyle w:val="Bibliography"/>
@@ -26002,7 +26136,7 @@
         </w:rPr>
         <w:t xml:space="preserve"> </w:t>
       </w:r>
-      <w:hyperlink r:id="rId301">
+      <w:hyperlink r:id="rId303">
         <w:r>
           <w:rPr>
             <w:rStyle w:val="Hyperlink"/>
@@ -26012,8 +26146,8 @@
         </w:r>
       </w:hyperlink>
     </w:p>
-    <w:bookmarkEnd w:id="302"/>
-    <w:bookmarkStart w:id="304" w:name="ref-tanaka2011"/>
+    <w:bookmarkEnd w:id="304"/>
+    <w:bookmarkStart w:id="306" w:name="ref-tanaka2011"/>
     <w:p>
       <w:pPr>
         <w:pStyle w:val="Bibliography"/>
@@ -26070,7 +26204,7 @@
         </w:rPr>
         <w:t xml:space="preserve"> </w:t>
       </w:r>
-      <w:hyperlink r:id="rId303">
+      <w:hyperlink r:id="rId305">
         <w:r>
           <w:rPr>
             <w:rStyle w:val="Hyperlink"/>
@@ -26080,8 +26214,8 @@
         </w:r>
       </w:hyperlink>
     </w:p>
-    <w:bookmarkEnd w:id="304"/>
-    <w:bookmarkStart w:id="306" w:name="ref-torrejon2017"/>
+    <w:bookmarkEnd w:id="306"/>
+    <w:bookmarkStart w:id="308" w:name="ref-torrejon2017"/>
     <w:p>
       <w:pPr>
         <w:pStyle w:val="Bibliography"/>
@@ -26138,7 +26272,7 @@
         </w:rPr>
         <w:t xml:space="preserve"> </w:t>
       </w:r>
-      <w:hyperlink r:id="rId305">
+      <w:hyperlink r:id="rId307">
         <w:r>
           <w:rPr>
             <w:rStyle w:val="Hyperlink"/>
@@ -26148,8 +26282,8 @@
         </w:r>
       </w:hyperlink>
     </w:p>
-    <w:bookmarkEnd w:id="306"/>
-    <w:bookmarkStart w:id="308" w:name="ref-turcu2022"/>
+    <w:bookmarkEnd w:id="308"/>
+    <w:bookmarkStart w:id="310" w:name="ref-turcu2022"/>
     <w:p>
       <w:pPr>
         <w:pStyle w:val="Bibliography"/>
@@ -26206,7 +26340,7 @@
         </w:rPr>
         <w:t xml:space="preserve"> </w:t>
       </w:r>
-      <w:hyperlink r:id="rId307">
+      <w:hyperlink r:id="rId309">
         <w:r>
           <w:rPr>
             <w:rStyle w:val="Hyperlink"/>
@@ -26216,8 +26350,8 @@
         </w:r>
       </w:hyperlink>
     </w:p>
-    <w:bookmarkEnd w:id="308"/>
-    <w:bookmarkStart w:id="310" w:name="ref-turian2020"/>
+    <w:bookmarkEnd w:id="310"/>
+    <w:bookmarkStart w:id="312" w:name="ref-turian2020"/>
     <w:p>
       <w:pPr>
         <w:pStyle w:val="Bibliography"/>
@@ -26318,7 +26452,7 @@
         </w:rPr>
         <w:t xml:space="preserve"> </w:t>
       </w:r>
-      <w:hyperlink r:id="rId309">
+      <w:hyperlink r:id="rId311">
         <w:r>
           <w:rPr>
             <w:rStyle w:val="Hyperlink"/>
@@ -26328,8 +26462,8 @@
         </w:r>
       </w:hyperlink>
     </w:p>
-    <w:bookmarkEnd w:id="310"/>
-    <w:bookmarkStart w:id="312" w:name="ref-uhlhaas2006"/>
+    <w:bookmarkEnd w:id="312"/>
+    <w:bookmarkStart w:id="314" w:name="ref-uhlhaas2006"/>
     <w:p>
       <w:pPr>
         <w:pStyle w:val="Bibliography"/>
@@ -26386,7 +26520,7 @@
         </w:rPr>
         <w:t xml:space="preserve"> </w:t>
       </w:r>
-      <w:hyperlink r:id="rId311">
+      <w:hyperlink r:id="rId313">
         <w:r>
           <w:rPr>
             <w:rStyle w:val="Hyperlink"/>
@@ -26396,8 +26530,8 @@
         </w:r>
       </w:hyperlink>
     </w:p>
-    <w:bookmarkEnd w:id="312"/>
-    <w:bookmarkStart w:id="314" w:name="ref-un-0"/>
+    <w:bookmarkEnd w:id="314"/>
+    <w:bookmarkStart w:id="316" w:name="ref-un-0"/>
     <w:p>
       <w:pPr>
         <w:pStyle w:val="Bibliography"/>
@@ -26458,7 +26592,7 @@
         </w:rPr>
         <w:t xml:space="preserve"> </w:t>
       </w:r>
-      <w:hyperlink r:id="rId313">
+      <w:hyperlink r:id="rId315">
         <w:r>
           <w:rPr>
             <w:rStyle w:val="Hyperlink"/>
@@ -26468,8 +26602,8 @@
         </w:r>
       </w:hyperlink>
     </w:p>
-    <w:bookmarkEnd w:id="314"/>
-    <w:bookmarkStart w:id="316" w:name="ref-sparsity-study"/>
+    <w:bookmarkEnd w:id="316"/>
+    <w:bookmarkStart w:id="318" w:name="ref-sparsity-study"/>
     <w:p>
       <w:pPr>
         <w:pStyle w:val="Bibliography"/>
@@ -26506,7 +26640,7 @@
         </w:rPr>
         <w:t xml:space="preserve"> </w:t>
       </w:r>
-      <w:hyperlink r:id="rId315">
+      <w:hyperlink r:id="rId317">
         <w:r>
           <w:rPr>
             <w:rStyle w:val="Hyperlink"/>
@@ -26516,8 +26650,8 @@
         </w:r>
       </w:hyperlink>
     </w:p>
-    <w:bookmarkEnd w:id="316"/>
-    <w:bookmarkStart w:id="318" w:name="ref-mit-code"/>
+    <w:bookmarkEnd w:id="318"/>
+    <w:bookmarkStart w:id="320" w:name="ref-mit-code"/>
     <w:p>
       <w:pPr>
         <w:pStyle w:val="Bibliography"/>
@@ -26562,7 +26696,7 @@
         </w:rPr>
         <w:t xml:space="preserve"> </w:t>
       </w:r>
-      <w:hyperlink r:id="rId317">
+      <w:hyperlink r:id="rId319">
         <w:r>
           <w:rPr>
             <w:rStyle w:val="Hyperlink"/>
@@ -26572,8 +26706,8 @@
         </w:r>
       </w:hyperlink>
     </w:p>
-    <w:bookmarkEnd w:id="318"/>
-    <w:bookmarkStart w:id="320" w:name="ref-vanderpol1926"/>
+    <w:bookmarkEnd w:id="320"/>
+    <w:bookmarkStart w:id="322" w:name="ref-vanderpol1926"/>
     <w:p>
       <w:pPr>
         <w:pStyle w:val="Bibliography"/>
@@ -26630,7 +26764,7 @@
         </w:rPr>
         <w:t xml:space="preserve"> </w:t>
       </w:r>
-      <w:hyperlink r:id="rId319">
+      <w:hyperlink r:id="rId321">
         <w:r>
           <w:rPr>
             <w:rStyle w:val="Hyperlink"/>
@@ -26640,8 +26774,8 @@
         </w:r>
       </w:hyperlink>
     </w:p>
-    <w:bookmarkEnd w:id="320"/>
-    <w:bookmarkStart w:id="322" w:name="ref-vaswani2017"/>
+    <w:bookmarkEnd w:id="322"/>
+    <w:bookmarkStart w:id="324" w:name="ref-vaswani2017"/>
     <w:p>
       <w:pPr>
         <w:pStyle w:val="Bibliography"/>
@@ -26710,7 +26844,7 @@
         </w:rPr>
         <w:t xml:space="preserve"> </w:t>
       </w:r>
-      <w:hyperlink r:id="rId321">
+      <w:hyperlink r:id="rId323">
         <w:r>
           <w:rPr>
             <w:rStyle w:val="Hyperlink"/>
@@ -26720,8 +26854,8 @@
         </w:r>
       </w:hyperlink>
     </w:p>
-    <w:bookmarkEnd w:id="322"/>
-    <w:bookmarkStart w:id="324" w:name="ref-spikevoice"/>
+    <w:bookmarkEnd w:id="324"/>
+    <w:bookmarkStart w:id="326" w:name="ref-spikevoice"/>
     <w:p>
       <w:pPr>
         <w:pStyle w:val="Bibliography"/>
@@ -26758,7 +26892,7 @@
         </w:rPr>
         <w:t xml:space="preserve"> </w:t>
       </w:r>
-      <w:hyperlink r:id="rId323">
+      <w:hyperlink r:id="rId325">
         <w:r>
           <w:rPr>
             <w:rStyle w:val="Hyperlink"/>
@@ -26768,8 +26902,8 @@
         </w:r>
       </w:hyperlink>
     </w:p>
-    <w:bookmarkEnd w:id="324"/>
-    <w:bookmarkStart w:id="326" w:name="ref-oscillator-ising-machines"/>
+    <w:bookmarkEnd w:id="326"/>
+    <w:bookmarkStart w:id="328" w:name="ref-oscillator-ising-machines"/>
     <w:p>
       <w:pPr>
         <w:pStyle w:val="Bibliography"/>
@@ -26806,7 +26940,7 @@
         </w:rPr>
         <w:t xml:space="preserve"> </w:t>
       </w:r>
-      <w:hyperlink r:id="rId325">
+      <w:hyperlink r:id="rId327">
         <w:r>
           <w:rPr>
             <w:rStyle w:val="Hyperlink"/>
@@ -26816,8 +26950,8 @@
         </w:r>
       </w:hyperlink>
     </w:p>
-    <w:bookmarkEnd w:id="326"/>
-    <w:bookmarkStart w:id="328" w:name="ref-winfree1967"/>
+    <w:bookmarkEnd w:id="328"/>
+    <w:bookmarkStart w:id="330" w:name="ref-winfree1967"/>
     <w:p>
       <w:pPr>
         <w:pStyle w:val="Bibliography"/>
@@ -26874,7 +27008,7 @@
         </w:rPr>
         <w:t xml:space="preserve"> </w:t>
       </w:r>
-      <w:hyperlink r:id="rId327">
+      <w:hyperlink r:id="rId329">
         <w:r>
           <w:rPr>
             <w:rStyle w:val="Hyperlink"/>
@@ -26884,8 +27018,8 @@
         </w:r>
       </w:hyperlink>
     </w:p>
-    <w:bookmarkEnd w:id="328"/>
-    <w:bookmarkStart w:id="330" w:name="ref-kope"/>
+    <w:bookmarkEnd w:id="330"/>
+    <w:bookmarkStart w:id="332" w:name="ref-kope"/>
     <w:p>
       <w:pPr>
         <w:pStyle w:val="Bibliography"/>
@@ -26954,7 +27088,7 @@
         </w:rPr>
         <w:t xml:space="preserve"> </w:t>
       </w:r>
-      <w:hyperlink r:id="rId329">
+      <w:hyperlink r:id="rId331">
         <w:r>
           <w:rPr>
             <w:rStyle w:val="Hyperlink"/>
@@ -26964,8 +27098,8 @@
         </w:r>
       </w:hyperlink>
     </w:p>
-    <w:bookmarkEnd w:id="330"/>
-    <w:bookmarkStart w:id="332" w:name="ref-yeung1999"/>
+    <w:bookmarkEnd w:id="332"/>
+    <w:bookmarkStart w:id="334" w:name="ref-yeung1999"/>
     <w:p>
       <w:pPr>
         <w:pStyle w:val="Bibliography"/>
@@ -27022,7 +27156,7 @@
         </w:rPr>
         <w:t xml:space="preserve"> </w:t>
       </w:r>
-      <w:hyperlink r:id="rId331">
+      <w:hyperlink r:id="rId333">
         <w:r>
           <w:rPr>
             <w:rStyle w:val="Hyperlink"/>
@@ -27032,8 +27166,8 @@
         </w:r>
       </w:hyperlink>
     </w:p>
-    <w:bookmarkEnd w:id="332"/>
-    <w:bookmarkStart w:id="334" w:name="ref-yu2025"/>
+    <w:bookmarkEnd w:id="334"/>
+    <w:bookmarkStart w:id="336" w:name="ref-yu2025"/>
     <w:p>
       <w:pPr>
         <w:pStyle w:val="Bibliography"/>
@@ -27102,7 +27236,7 @@
         </w:rPr>
         <w:t xml:space="preserve"> </w:t>
       </w:r>
-      <w:hyperlink r:id="rId333">
+      <w:hyperlink r:id="rId335">
         <w:r>
           <w:rPr>
             <w:rStyle w:val="Hyperlink"/>
@@ -27112,8 +27246,8 @@
         </w:r>
       </w:hyperlink>
     </w:p>
-    <w:bookmarkEnd w:id="334"/>
-    <w:bookmarkStart w:id="336" w:name="ref-zhang2026"/>
+    <w:bookmarkEnd w:id="336"/>
+    <w:bookmarkStart w:id="338" w:name="ref-zhang2026"/>
     <w:p>
       <w:pPr>
         <w:pStyle w:val="Bibliography"/>
@@ -27238,7 +27372,7 @@
         </w:rPr>
         <w:t xml:space="preserve"> </w:t>
       </w:r>
-      <w:hyperlink r:id="rId335">
+      <w:hyperlink r:id="rId337">
         <w:r>
           <w:rPr>
             <w:rStyle w:val="Hyperlink"/>
@@ -27248,8 +27382,8 @@
         </w:r>
       </w:hyperlink>
     </w:p>
-    <w:bookmarkEnd w:id="336"/>
-    <w:bookmarkStart w:id="338" w:name="ref-ada-fe"/>
+    <w:bookmarkEnd w:id="338"/>
+    <w:bookmarkStart w:id="340" w:name="ref-ada-fe"/>
     <w:p>
       <w:pPr>
         <w:pStyle w:val="Bibliography"/>
@@ -27286,7 +27420,7 @@
         </w:rPr>
         <w:t xml:space="preserve"> </w:t>
       </w:r>
-      <w:hyperlink r:id="rId337">
+      <w:hyperlink r:id="rId339">
         <w:r>
           <w:rPr>
             <w:rStyle w:val="Hyperlink"/>
@@ -27296,8 +27430,8 @@
         </w:r>
       </w:hyperlink>
     </w:p>
-    <w:bookmarkEnd w:id="338"/>
-    <w:bookmarkStart w:id="340" w:name="ref-zhang2023"/>
+    <w:bookmarkEnd w:id="340"/>
+    <w:bookmarkStart w:id="342" w:name="ref-zhang2023"/>
     <w:p>
       <w:pPr>
         <w:pStyle w:val="Bibliography"/>
@@ -27354,7 +27488,7 @@
         </w:rPr>
         <w:t xml:space="preserve"> </w:t>
       </w:r>
-      <w:hyperlink r:id="rId339">
+      <w:hyperlink r:id="rId341">
         <w:r>
           <w:rPr>
             <w:rStyle w:val="Hyperlink"/>
@@ -27364,8 +27498,8 @@
         </w:r>
       </w:hyperlink>
     </w:p>
-    <w:bookmarkEnd w:id="340"/>
-    <w:bookmarkStart w:id="342" w:name="ref-gdd"/>
+    <w:bookmarkEnd w:id="342"/>
+    <w:bookmarkStart w:id="344" w:name="ref-gdd"/>
     <w:p>
       <w:pPr>
         <w:pStyle w:val="Bibliography"/>
@@ -27402,7 +27536,7 @@
         </w:rPr>
         <w:t xml:space="preserve"> </w:t>
       </w:r>
-      <w:hyperlink r:id="rId341">
+      <w:hyperlink r:id="rId343">
         <w:r>
           <w:rPr>
             <w:rStyle w:val="Hyperlink"/>
@@ -27412,9 +27546,9 @@
         </w:r>
       </w:hyperlink>
     </w:p>
-    <w:bookmarkEnd w:id="342"/>
-    <w:bookmarkEnd w:id="343"/>
     <w:bookmarkEnd w:id="344"/>
+    <w:bookmarkEnd w:id="345"/>
+    <w:bookmarkEnd w:id="346"/>
     <w:sectPr>
       <w:footnotePr>
         <w:numRestart w:val="eachSect"/>

</xml_diff>

<commit_message>
say what the machine-learning lines share with stuart-landau, and what they do not
The sentence carried a definition, a canonical form and two examples through one
colon, and called coRNN and LinOSS "the machine-learning case", which reads as
the only one rather than the ones in this survey. Split in two, scoped to the
systems surveyed here, and "in addition to its phase" now says what the second
coordinate is additional to.

It also closes the gap between the opening definition and two of the thirteen
systems. An oscillator here "does not settle at a resting point ... and comes
back to that trajectory after being pushed off it", which coRNN and LinOSS do
not do: they keep the planar state without the amplitude-restoring terms, so
they oscillate under drive rather than on their own. Figure 1 now makes the
same point.
</commit_message>
<xml_diff>
--- a/papers/01-evidence-audit/from-synchronization-physics-to-trained-dynamics.docx
+++ b/papers/01-evidence-audit/from-synchronization-physics-to-trained-dynamics.docx
@@ -557,7 +557,7 @@
         <w:rPr>
           <w:lang w:val="en-GB"/>
         </w:rPr>
-        <w:t xml:space="preserve">, and the Kuramoto and Winfree families this survey meets most often are of that kind. Models that keep the distance from the centre as well, the</w:t>
+        <w:t xml:space="preserve">, and the Kuramoto and Winfree families this survey meets most often are of that kind. Models that track an oscillator’s distance from the centre in addition to its phase carry a second coordinate, the</w:t>
       </w:r>
       <w:r>
         <w:rPr>
@@ -577,7 +577,7 @@
         <w:rPr>
           <w:lang w:val="en-GB"/>
         </w:rPr>
-        <w:t xml:space="preserve">, describe a state living in a plane rather than on a circle: the Stuart-Landau equation is the canonical form, and the damped second-order recurrences of the coRNN</w:t>
+        <w:t xml:space="preserve">, so the state lives in a plane rather than on a circle. The Stuart-Landau equation is the canonical form; among the systems surveyed here, the damped second-order recurrences of the coRNN</w:t>
       </w:r>
       <w:r>
         <w:rPr>
@@ -655,7 +655,7 @@
         <w:rPr>
           <w:lang w:val="en-GB"/>
         </w:rPr>
-        <w:t xml:space="preserve">lines are the machine-learning case.</w:t>
+        <w:t xml:space="preserve">lines share that planar state, though without the amplitude-restoring terms that make a rhythm self-sustaining, so they oscillate under drive rather than on their own.</w:t>
       </w:r>
     </w:p>
     <w:p>

</xml_diff>

<commit_message>
rebuild paper 01 formats
</commit_message>
<xml_diff>
--- a/papers/01-evidence-audit/from-synchronization-physics-to-trained-dynamics.docx
+++ b/papers/01-evidence-audit/from-synchronization-physics-to-trained-dynamics.docx
@@ -5094,19 +5094,19 @@
           <w:bCs/>
           <w:lang w:val="en-GB"/>
         </w:rPr>
-        <w:t xml:space="preserve">State-space models put a linear dynamical system back in.</w:t>
-      </w:r>
-      <w:r>
-        <w:rPr>
-          <w:lang w:val="en-GB"/>
-        </w:rPr>
-        <w:t xml:space="preserve"> </w:t>
-      </w:r>
-      <w:r>
-        <w:rPr>
-          <w:lang w:val="en-GB"/>
-        </w:rPr>
-        <w:t xml:space="preserve">S4</w:t>
+        <w:t xml:space="preserve">Diffusion models iterate over noise rather than over time.</w:t>
+      </w:r>
+      <w:r>
+        <w:rPr>
+          <w:lang w:val="en-GB"/>
+        </w:rPr>
+        <w:t xml:space="preserve"> </w:t>
+      </w:r>
+      <w:r>
+        <w:rPr>
+          <w:lang w:val="en-GB"/>
+        </w:rPr>
+        <w:t xml:space="preserve">A diffusion model</w:t>
       </w:r>
       <w:r>
         <w:rPr>
@@ -5120,13 +5120,34 @@
         </w:rPr>
         <w:t xml:space="preserve">(</w:t>
       </w:r>
-      <w:hyperlink w:anchor="ref-s4">
-        <w:r>
-          <w:rPr>
-            <w:rStyle w:val="Hyperlink"/>
-            <w:lang w:val="en-GB"/>
-          </w:rPr>
-          <w:t xml:space="preserve">Gu et al., 2022</w:t>
+      <w:hyperlink w:anchor="ref-ho2020">
+        <w:r>
+          <w:rPr>
+            <w:rStyle w:val="Hyperlink"/>
+            <w:lang w:val="en-GB"/>
+          </w:rPr>
+          <w:t xml:space="preserve">Ho et al., 2020</w:t>
+        </w:r>
+      </w:hyperlink>
+      <w:r>
+        <w:rPr>
+          <w:lang w:val="en-GB"/>
+        </w:rPr>
+        <w:t xml:space="preserve">;</w:t>
+      </w:r>
+      <w:r>
+        <w:rPr>
+          <w:lang w:val="en-GB"/>
+        </w:rPr>
+        <w:t xml:space="preserve"> </w:t>
+      </w:r>
+      <w:hyperlink w:anchor="ref-sohl-dickstein2015">
+        <w:r>
+          <w:rPr>
+            <w:rStyle w:val="Hyperlink"/>
+            <w:lang w:val="en-GB"/>
+          </w:rPr>
+          <w:t xml:space="preserve">Sohl-Dickstein et al., 2015</w:t>
         </w:r>
       </w:hyperlink>
       <w:r>
@@ -5145,138 +5166,7 @@
         <w:rPr>
           <w:lang w:val="en-GB"/>
         </w:rPr>
-        <w:t xml:space="preserve">recovers a constant-size recurrent state while keeping parallel training, and finds its spectrum’s initialization to be load-bearing rather than incidental</w:t>
-      </w:r>
-      <w:r>
-        <w:rPr>
-          <w:lang w:val="en-GB"/>
-        </w:rPr>
-        <w:t xml:space="preserve"> </w:t>
-      </w:r>
-      <w:r>
-        <w:rPr>
-          <w:lang w:val="en-GB"/>
-        </w:rPr>
-        <w:t xml:space="preserve">(</w:t>
-      </w:r>
-      <w:hyperlink w:anchor="ref-how-train-your-hippo">
-        <w:r>
-          <w:rPr>
-            <w:rStyle w:val="Hyperlink"/>
-            <w:lang w:val="en-GB"/>
-          </w:rPr>
-          <w:t xml:space="preserve">Gu et al., 2023</w:t>
-        </w:r>
-      </w:hyperlink>
-      <w:r>
-        <w:rPr>
-          <w:lang w:val="en-GB"/>
-        </w:rPr>
-        <w:t xml:space="preserve">)</w:t>
-      </w:r>
-      <w:r>
-        <w:rPr>
-          <w:lang w:val="en-GB"/>
-        </w:rPr>
-        <w:t xml:space="preserve">; Mamba</w:t>
-      </w:r>
-      <w:r>
-        <w:rPr>
-          <w:lang w:val="en-GB"/>
-        </w:rPr>
-        <w:t xml:space="preserve"> </w:t>
-      </w:r>
-      <w:r>
-        <w:rPr>
-          <w:lang w:val="en-GB"/>
-        </w:rPr>
-        <w:t xml:space="preserve">(</w:t>
-      </w:r>
-      <w:hyperlink w:anchor="ref-mamba">
-        <w:r>
-          <w:rPr>
-            <w:rStyle w:val="Hyperlink"/>
-            <w:lang w:val="en-GB"/>
-          </w:rPr>
-          <w:t xml:space="preserve">Gu &amp; Dao, 2023</w:t>
-        </w:r>
-      </w:hyperlink>
-      <w:r>
-        <w:rPr>
-          <w:lang w:val="en-GB"/>
-        </w:rPr>
-        <w:t xml:space="preserve">)</w:t>
-      </w:r>
-      <w:r>
-        <w:rPr>
-          <w:lang w:val="en-GB"/>
-        </w:rPr>
-        <w:t xml:space="preserve"> </w:t>
-      </w:r>
-      <w:r>
-        <w:rPr>
-          <w:lang w:val="en-GB"/>
-        </w:rPr>
-        <w:t xml:space="preserve">makes the state transition input-dependent and reaches Transformer-quality language modelling. This is the family the oscillatory recurrences are closest to: LinOSS</w:t>
-      </w:r>
-      <w:r>
-        <w:rPr>
-          <w:lang w:val="en-GB"/>
-        </w:rPr>
-        <w:t xml:space="preserve"> </w:t>
-      </w:r>
-      <w:r>
-        <w:rPr>
-          <w:i/>
-          <w:iCs/>
-          <w:lang w:val="en-GB"/>
-        </w:rPr>
-        <w:t xml:space="preserve">is</w:t>
-      </w:r>
-      <w:r>
-        <w:rPr>
-          <w:lang w:val="en-GB"/>
-        </w:rPr>
-        <w:t xml:space="preserve"> </w:t>
-      </w:r>
-      <w:r>
-        <w:rPr>
-          <w:lang w:val="en-GB"/>
-        </w:rPr>
-        <w:t xml:space="preserve">a state-space model whose transition is a bank of harmonic oscillators, which is why it is also the oscillator system with the longest gradient horizon in the survey, roughly fifty thousand steps; UnICORNN’s 17,984 is the longest for a nonlinear one. Hybrids interleave the two, keeping a few attention layers for recall over a mostly recurrent stack</w:t>
-      </w:r>
-      <w:r>
-        <w:rPr>
-          <w:lang w:val="en-GB"/>
-        </w:rPr>
-        <w:t xml:space="preserve"> </w:t>
-      </w:r>
-      <w:r>
-        <w:rPr>
-          <w:lang w:val="en-GB"/>
-        </w:rPr>
-        <w:t xml:space="preserve">(</w:t>
-      </w:r>
-      <w:hyperlink w:anchor="ref-lieber2024">
-        <w:r>
-          <w:rPr>
-            <w:rStyle w:val="Hyperlink"/>
-            <w:lang w:val="en-GB"/>
-          </w:rPr>
-          <w:t xml:space="preserve">Lieber et al., 2024</w:t>
-        </w:r>
-      </w:hyperlink>
-      <w:r>
-        <w:rPr>
-          <w:lang w:val="en-GB"/>
-        </w:rPr>
-        <w:t xml:space="preserve">)</w:t>
-      </w:r>
-      <w:r>
-        <w:rPr>
-          <w:lang w:val="en-GB"/>
-        </w:rPr>
-        <w:t xml:space="preserve">.</w:t>
+        <w:t xml:space="preserve">carries nothing between inputs; it generates by running a learned denoiser, itself a convolutional or attention network, for a fixed number of steps down a noise schedule, so the computation is a dynamical system over noise level rather than over the time axis of a signal. That makes it the conventional family closest in shape to a trained oscillator field settling from a random initial condition, which is why Un-0 is scored against diffusion baselines and why Kuramoto Orientation Diffusion could replace the Gaussian forward process with stochastic Kuramoto dynamics outright.</w:t>
       </w:r>
     </w:p>
     <w:p>
@@ -5289,19 +5179,19 @@
           <w:bCs/>
           <w:lang w:val="en-GB"/>
         </w:rPr>
-        <w:t xml:space="preserve">Spiking networks are the nearest neighbour.</w:t>
-      </w:r>
-      <w:r>
-        <w:rPr>
-          <w:lang w:val="en-GB"/>
-        </w:rPr>
-        <w:t xml:space="preserve"> </w:t>
-      </w:r>
-      <w:r>
-        <w:rPr>
-          <w:lang w:val="en-GB"/>
-        </w:rPr>
-        <w:t xml:space="preserve">A spiking unit is an oscillator of a restricted kind: it integrates input, crosses a threshold, emits a discrete event, and resets. That discreteness is what makes it efficient on neuromorphic hardware and what makes it hard to train, since the threshold is non-differentiable, so gradient methods need a surrogate and the choice of surrogate is itself a modelling decision</w:t>
+        <w:t xml:space="preserve">State-space models put a linear dynamical system back in.</w:t>
+      </w:r>
+      <w:r>
+        <w:rPr>
+          <w:lang w:val="en-GB"/>
+        </w:rPr>
+        <w:t xml:space="preserve"> </w:t>
+      </w:r>
+      <w:r>
+        <w:rPr>
+          <w:lang w:val="en-GB"/>
+        </w:rPr>
+        <w:t xml:space="preserve">S4</w:t>
       </w:r>
       <w:r>
         <w:rPr>
@@ -5315,13 +5205,13 @@
         </w:rPr>
         <w:t xml:space="preserve">(</w:t>
       </w:r>
-      <w:hyperlink w:anchor="ref-neftci2019">
-        <w:r>
-          <w:rPr>
-            <w:rStyle w:val="Hyperlink"/>
-            <w:lang w:val="en-GB"/>
-          </w:rPr>
-          <w:t xml:space="preserve">Neftci et al., 2019</w:t>
+      <w:hyperlink w:anchor="ref-s4">
+        <w:r>
+          <w:rPr>
+            <w:rStyle w:val="Hyperlink"/>
+            <w:lang w:val="en-GB"/>
+          </w:rPr>
+          <w:t xml:space="preserve">Gu et al., 2022</w:t>
         </w:r>
       </w:hyperlink>
       <w:r>
@@ -5334,7 +5224,13 @@
         <w:rPr>
           <w:lang w:val="en-GB"/>
         </w:rPr>
-        <w:t xml:space="preserve">. Oscillator models keep the state continuous, so coupling is differentiable and no surrogate is needed, and they carry structure a threshold unit discards: a natural frequency, a phase relationship to every other unit, and a graded rather than binary response to input. Recent work narrows the gap from the other side, training networks of Morris–Lecar neurons directly with backpropagation</w:t>
+        <w:t xml:space="preserve"> </w:t>
+      </w:r>
+      <w:r>
+        <w:rPr>
+          <w:lang w:val="en-GB"/>
+        </w:rPr>
+        <w:t xml:space="preserve">recovers a constant-size recurrent state while keeping parallel training, and finds its spectrum’s initialization to be load-bearing rather than incidental</w:t>
       </w:r>
       <w:r>
         <w:rPr>
@@ -5348,20 +5244,157 @@
         </w:rPr>
         <w:t xml:space="preserve">(</w:t>
       </w:r>
-      <w:hyperlink w:anchor="ref-akbari2025">
-        <w:r>
-          <w:rPr>
-            <w:rStyle w:val="Hyperlink"/>
-            <w:lang w:val="en-GB"/>
-          </w:rPr>
-          <w:t xml:space="preserve">Akbari et al., 2025</w:t>
-        </w:r>
-      </w:hyperlink>
-      <w:r>
-        <w:rPr>
-          <w:lang w:val="en-GB"/>
-        </w:rPr>
-        <w:t xml:space="preserve">, preprint)</w:t>
+      <w:hyperlink w:anchor="ref-how-train-your-hippo">
+        <w:r>
+          <w:rPr>
+            <w:rStyle w:val="Hyperlink"/>
+            <w:lang w:val="en-GB"/>
+          </w:rPr>
+          <w:t xml:space="preserve">Gu et al., 2023</w:t>
+        </w:r>
+      </w:hyperlink>
+      <w:r>
+        <w:rPr>
+          <w:lang w:val="en-GB"/>
+        </w:rPr>
+        <w:t xml:space="preserve">)</w:t>
+      </w:r>
+      <w:r>
+        <w:rPr>
+          <w:lang w:val="en-GB"/>
+        </w:rPr>
+        <w:t xml:space="preserve">; Mamba</w:t>
+      </w:r>
+      <w:r>
+        <w:rPr>
+          <w:lang w:val="en-GB"/>
+        </w:rPr>
+        <w:t xml:space="preserve"> </w:t>
+      </w:r>
+      <w:r>
+        <w:rPr>
+          <w:lang w:val="en-GB"/>
+        </w:rPr>
+        <w:t xml:space="preserve">(</w:t>
+      </w:r>
+      <w:hyperlink w:anchor="ref-mamba">
+        <w:r>
+          <w:rPr>
+            <w:rStyle w:val="Hyperlink"/>
+            <w:lang w:val="en-GB"/>
+          </w:rPr>
+          <w:t xml:space="preserve">Gu &amp; Dao, 2023</w:t>
+        </w:r>
+      </w:hyperlink>
+      <w:r>
+        <w:rPr>
+          <w:lang w:val="en-GB"/>
+        </w:rPr>
+        <w:t xml:space="preserve">)</w:t>
+      </w:r>
+      <w:r>
+        <w:rPr>
+          <w:lang w:val="en-GB"/>
+        </w:rPr>
+        <w:t xml:space="preserve"> </w:t>
+      </w:r>
+      <w:r>
+        <w:rPr>
+          <w:lang w:val="en-GB"/>
+        </w:rPr>
+        <w:t xml:space="preserve">makes the state transition input-dependent and reaches Transformer-quality language modelling. RWKV</w:t>
+      </w:r>
+      <w:r>
+        <w:rPr>
+          <w:lang w:val="en-GB"/>
+        </w:rPr>
+        <w:t xml:space="preserve"> </w:t>
+      </w:r>
+      <w:r>
+        <w:rPr>
+          <w:lang w:val="en-GB"/>
+        </w:rPr>
+        <w:t xml:space="preserve">(</w:t>
+      </w:r>
+      <w:hyperlink w:anchor="ref-peng2023">
+        <w:r>
+          <w:rPr>
+            <w:rStyle w:val="Hyperlink"/>
+            <w:lang w:val="en-GB"/>
+          </w:rPr>
+          <w:t xml:space="preserve">Peng et al., 2023</w:t>
+        </w:r>
+      </w:hyperlink>
+      <w:r>
+        <w:rPr>
+          <w:lang w:val="en-GB"/>
+        </w:rPr>
+        <w:t xml:space="preserve">)</w:t>
+      </w:r>
+      <w:r>
+        <w:rPr>
+          <w:lang w:val="en-GB"/>
+        </w:rPr>
+        <w:t xml:space="preserve"> </w:t>
+      </w:r>
+      <w:r>
+        <w:rPr>
+          <w:lang w:val="en-GB"/>
+        </w:rPr>
+        <w:t xml:space="preserve">arrives at the same shape from the attention side, rewriting attention as a linear recurrence so that a Transformer-style model trains in parallel and runs with a constant-size state, which makes it the mainstream counterpart of the attention-as-dynamics reading that Kuramoto Attention and FSN give. This is the family the oscillatory recurrences are closest to: LinOSS</w:t>
+      </w:r>
+      <w:r>
+        <w:rPr>
+          <w:lang w:val="en-GB"/>
+        </w:rPr>
+        <w:t xml:space="preserve"> </w:t>
+      </w:r>
+      <w:r>
+        <w:rPr>
+          <w:i/>
+          <w:iCs/>
+          <w:lang w:val="en-GB"/>
+        </w:rPr>
+        <w:t xml:space="preserve">is</w:t>
+      </w:r>
+      <w:r>
+        <w:rPr>
+          <w:lang w:val="en-GB"/>
+        </w:rPr>
+        <w:t xml:space="preserve"> </w:t>
+      </w:r>
+      <w:r>
+        <w:rPr>
+          <w:lang w:val="en-GB"/>
+        </w:rPr>
+        <w:t xml:space="preserve">a state-space model whose transition is a bank of harmonic oscillators, which is why it is also the oscillator system with the longest gradient horizon in the survey, roughly fifty thousand steps; UnICORNN’s 17,984 is the longest for a nonlinear one. Hybrids interleave the two, keeping a few attention layers for recall over a mostly recurrent stack</w:t>
+      </w:r>
+      <w:r>
+        <w:rPr>
+          <w:lang w:val="en-GB"/>
+        </w:rPr>
+        <w:t xml:space="preserve"> </w:t>
+      </w:r>
+      <w:r>
+        <w:rPr>
+          <w:lang w:val="en-GB"/>
+        </w:rPr>
+        <w:t xml:space="preserve">(</w:t>
+      </w:r>
+      <w:hyperlink w:anchor="ref-lieber2024">
+        <w:r>
+          <w:rPr>
+            <w:rStyle w:val="Hyperlink"/>
+            <w:lang w:val="en-GB"/>
+          </w:rPr>
+          <w:t xml:space="preserve">Lieber et al., 2024</w:t>
+        </w:r>
+      </w:hyperlink>
+      <w:r>
+        <w:rPr>
+          <w:lang w:val="en-GB"/>
+        </w:rPr>
+        <w:t xml:space="preserve">)</w:t>
       </w:r>
       <w:r>
         <w:rPr>
@@ -5369,18 +5402,109 @@
         </w:rPr>
         <w:t xml:space="preserve">.</w:t>
       </w:r>
-      <w:r>
-        <w:rPr>
-          <w:lang w:val="en-GB"/>
-        </w:rPr>
-        <w:t xml:space="preserve"> </w:t>
-      </w:r>
+    </w:p>
+    <w:p>
+      <w:pPr>
+        <w:pStyle w:val="BodyText"/>
+      </w:pPr>
       <w:r>
         <w:rPr>
           <w:b/>
           <w:bCs/>
           <w:lang w:val="en-GB"/>
         </w:rPr>
+        <w:t xml:space="preserve">Spiking networks are the nearest neighbour.</w:t>
+      </w:r>
+      <w:r>
+        <w:rPr>
+          <w:lang w:val="en-GB"/>
+        </w:rPr>
+        <w:t xml:space="preserve"> </w:t>
+      </w:r>
+      <w:r>
+        <w:rPr>
+          <w:lang w:val="en-GB"/>
+        </w:rPr>
+        <w:t xml:space="preserve">A spiking unit is an oscillator of a restricted kind: it integrates input, crosses a threshold, emits a discrete event, and resets. That discreteness is what makes it efficient on neuromorphic hardware and what makes it hard to train, since the threshold is non-differentiable, so gradient methods need a surrogate and the choice of surrogate is itself a modelling decision</w:t>
+      </w:r>
+      <w:r>
+        <w:rPr>
+          <w:lang w:val="en-GB"/>
+        </w:rPr>
+        <w:t xml:space="preserve"> </w:t>
+      </w:r>
+      <w:r>
+        <w:rPr>
+          <w:lang w:val="en-GB"/>
+        </w:rPr>
+        <w:t xml:space="preserve">(</w:t>
+      </w:r>
+      <w:hyperlink w:anchor="ref-neftci2019">
+        <w:r>
+          <w:rPr>
+            <w:rStyle w:val="Hyperlink"/>
+            <w:lang w:val="en-GB"/>
+          </w:rPr>
+          <w:t xml:space="preserve">Neftci et al., 2019</w:t>
+        </w:r>
+      </w:hyperlink>
+      <w:r>
+        <w:rPr>
+          <w:lang w:val="en-GB"/>
+        </w:rPr>
+        <w:t xml:space="preserve">)</w:t>
+      </w:r>
+      <w:r>
+        <w:rPr>
+          <w:lang w:val="en-GB"/>
+        </w:rPr>
+        <w:t xml:space="preserve">. Oscillator models keep the state continuous, so coupling is differentiable and no surrogate is needed, and they carry structure a threshold unit discards: a natural frequency, a phase relationship to every other unit, and a graded rather than binary response to input. Recent work narrows the gap from the other side, training networks of Morris–Lecar neurons directly with backpropagation</w:t>
+      </w:r>
+      <w:r>
+        <w:rPr>
+          <w:lang w:val="en-GB"/>
+        </w:rPr>
+        <w:t xml:space="preserve"> </w:t>
+      </w:r>
+      <w:r>
+        <w:rPr>
+          <w:lang w:val="en-GB"/>
+        </w:rPr>
+        <w:t xml:space="preserve">(</w:t>
+      </w:r>
+      <w:hyperlink w:anchor="ref-akbari2025">
+        <w:r>
+          <w:rPr>
+            <w:rStyle w:val="Hyperlink"/>
+            <w:lang w:val="en-GB"/>
+          </w:rPr>
+          <w:t xml:space="preserve">Akbari et al., 2025</w:t>
+        </w:r>
+      </w:hyperlink>
+      <w:r>
+        <w:rPr>
+          <w:lang w:val="en-GB"/>
+        </w:rPr>
+        <w:t xml:space="preserve">, preprint)</w:t>
+      </w:r>
+      <w:r>
+        <w:rPr>
+          <w:lang w:val="en-GB"/>
+        </w:rPr>
+        <w:t xml:space="preserve">.</w:t>
+      </w:r>
+      <w:r>
+        <w:rPr>
+          <w:lang w:val="en-GB"/>
+        </w:rPr>
+        <w:t xml:space="preserve"> </w:t>
+      </w:r>
+      <w:r>
+        <w:rPr>
+          <w:b/>
+          <w:bCs/>
+          <w:lang w:val="en-GB"/>
+        </w:rPr>
         <w:t xml:space="preserve">Whether continuous state makes oscillator networks easier to train is open, and this survey’s own evidence cautions against assuming it.</w:t>
       </w:r>
       <w:r>
@@ -5403,9 +5527,9 @@
       <w:r>
         <w:drawing>
           <wp:inline>
-            <wp:extent cx="5334000" cy="1068210"/>
+            <wp:extent cx="5334000" cy="1293838"/>
             <wp:effectExtent b="0" l="0" r="0" t="0"/>
-            <wp:docPr descr="Conventional neural network architectures, by how each one holds the past. Above the axis, a state is carried forward one step at a time; below it, the whole window is recomputed at every step. An oscillator field belongs to the upper track, but its state evolves under a fixed differential equation rather than under a transition learned from scratch, which is the substance of both the efficiency argument made for it and the training difficulty reported against it." title="" id="36" name="Picture"/>
+            <wp:docPr descr="Conventional neural network architectures, by how each one holds the past. Above the axis, a state is carried forward one step at a time; below it, the whole window is recomputed at every step. Diffusion sits below the axis as well: it keeps nothing between inputs and iterates a denoiser over noise levels rather than over time, the iteration Kuramoto Orientation Diffusion makes oscillatory. An oscillator field belongs to the upper track, but its state evolves under a fixed differential equation rather than under a transition learned from scratch, which is the substance of both the efficiency argument made for it and the training difficulty reported against it." title="" id="36" name="Picture"/>
             <a:graphic>
               <a:graphicData uri="http://schemas.openxmlformats.org/drawingml/2006/picture">
                 <pic:pic>
@@ -5424,7 +5548,7 @@
                   <pic:spPr bwMode="auto">
                     <a:xfrm>
                       <a:off x="0" y="0"/>
-                      <a:ext cx="5334000" cy="1068210"/>
+                      <a:ext cx="5334000" cy="1293838"/>
                     </a:xfrm>
                     <a:prstGeom prst="rect">
                       <a:avLst/>
@@ -5451,7 +5575,7 @@
         <w:rPr>
           <w:lang w:val="en-GB"/>
         </w:rPr>
-        <w:t xml:space="preserve">Figure 8. Conventional neural network architectures, by how each one holds the past. Above the axis, a state is carried forward one step at a time; below it, the whole window is recomputed at every step. An oscillator field belongs to the upper track, but its state evolves under a fixed differential equation rather than under a transition learned from scratch, which is the substance of both the efficiency argument made for it and the training difficulty reported against it.</w:t>
+        <w:t xml:space="preserve">Figure 8. Conventional neural network architectures, by how each one holds the past. Above the axis, a state is carried forward one step at a time; below it, the whole window is recomputed at every step. Diffusion sits below the axis as well: it keeps nothing between inputs and iterates a denoiser over noise levels rather than over time, the iteration Kuramoto Orientation Diffusion makes oscillatory. An oscillator field belongs to the upper track, but its state evolves under a fixed differential equation rather than under a transition learned from scratch, which is the substance of both the efficiency argument made for it and the training difficulty reported against it.</w:t>
       </w:r>
     </w:p>
     <w:bookmarkEnd w:id="38"/>
@@ -19419,7 +19543,7 @@
       </w:r>
     </w:p>
     <w:bookmarkEnd w:id="86"/>
-    <w:bookmarkStart w:id="348" w:name="g-questions-the-record-leaves-open"/>
+    <w:bookmarkStart w:id="354" w:name="g-questions-the-record-leaves-open"/>
     <w:p>
       <w:pPr>
         <w:pStyle w:val="Heading1"/>
@@ -19799,7 +19923,7 @@
         <w:t xml:space="preserve">References</w:t>
       </w:r>
     </w:p>
-    <w:bookmarkStart w:id="347" w:name="refs"/>
+    <w:bookmarkStart w:id="353" w:name="refs"/>
     <w:bookmarkStart w:id="88" w:name="ref-abrams2004"/>
     <w:p>
       <w:pPr>
@@ -23314,7 +23438,7 @@
       </w:hyperlink>
     </w:p>
     <w:bookmarkEnd w:id="188"/>
-    <w:bookmarkStart w:id="190" w:name="ref-hochreiter1997"/>
+    <w:bookmarkStart w:id="190" w:name="ref-ho2020"/>
     <w:p>
       <w:pPr>
         <w:pStyle w:val="Bibliography"/>
@@ -23323,6 +23447,86 @@
         <w:rPr>
           <w:lang w:val="en-GB"/>
         </w:rPr>
+        <w:t xml:space="preserve">Ho, J., Jain, A., &amp; Abbeel, P. (2020). Denoising diffusion probabilistic models.</w:t>
+      </w:r>
+      <w:r>
+        <w:rPr>
+          <w:lang w:val="en-GB"/>
+        </w:rPr>
+        <w:t xml:space="preserve"> </w:t>
+      </w:r>
+      <w:r>
+        <w:rPr>
+          <w:i/>
+          <w:iCs/>
+          <w:lang w:val="en-GB"/>
+        </w:rPr>
+        <w:t xml:space="preserve">Advances in Neural Information Processing Systems 33: Annual Conference on Neural Information Processing Systems 2020,</w:t>
+      </w:r>
+      <w:r>
+        <w:rPr>
+          <w:i/>
+          <w:iCs/>
+          <w:lang w:val="en-GB"/>
+        </w:rPr>
+        <w:t xml:space="preserve"> </w:t>
+      </w:r>
+      <w:r>
+        <w:rPr>
+          <w:i/>
+          <w:iCs/>
+          <w:lang w:val="en-GB"/>
+        </w:rPr>
+        <w:t xml:space="preserve">NeurIPS</w:t>
+      </w:r>
+      <w:r>
+        <w:rPr>
+          <w:i/>
+          <w:iCs/>
+          <w:lang w:val="en-GB"/>
+        </w:rPr>
+        <w:t xml:space="preserve"> </w:t>
+      </w:r>
+      <w:r>
+        <w:rPr>
+          <w:i/>
+          <w:iCs/>
+          <w:lang w:val="en-GB"/>
+        </w:rPr>
+        <w:t xml:space="preserve">2020, December 6-12, 2020, Virtual</w:t>
+      </w:r>
+      <w:r>
+        <w:rPr>
+          <w:lang w:val="en-GB"/>
+        </w:rPr>
+        <w:t xml:space="preserve">.</w:t>
+      </w:r>
+      <w:r>
+        <w:rPr>
+          <w:lang w:val="en-GB"/>
+        </w:rPr>
+        <w:t xml:space="preserve"> </w:t>
+      </w:r>
+      <w:hyperlink r:id="rId189">
+        <w:r>
+          <w:rPr>
+            <w:rStyle w:val="Hyperlink"/>
+            <w:lang w:val="en-GB"/>
+          </w:rPr>
+          <w:t xml:space="preserve">https://proceedings.neurips.cc/paper/2020/hash/4c5bcfec8584af0d967f1ab10179ca4b-Abstract.html</w:t>
+        </w:r>
+      </w:hyperlink>
+    </w:p>
+    <w:bookmarkEnd w:id="190"/>
+    <w:bookmarkStart w:id="192" w:name="ref-hochreiter1997"/>
+    <w:p>
+      <w:pPr>
+        <w:pStyle w:val="Bibliography"/>
+      </w:pPr>
+      <w:r>
+        <w:rPr>
+          <w:lang w:val="en-GB"/>
+        </w:rPr>
         <w:t xml:space="preserve">Hochreiter, S., &amp; Schmidhuber, J. (1997). Long short-term memory.</w:t>
       </w:r>
       <w:r>
@@ -23371,7 +23575,7 @@
         </w:rPr>
         <w:t xml:space="preserve"> </w:t>
       </w:r>
-      <w:hyperlink r:id="rId189">
+      <w:hyperlink r:id="rId191">
         <w:r>
           <w:rPr>
             <w:rStyle w:val="Hyperlink"/>
@@ -23381,8 +23585,8 @@
         </w:r>
       </w:hyperlink>
     </w:p>
-    <w:bookmarkEnd w:id="190"/>
-    <w:bookmarkStart w:id="192" w:name="ref-hodgkin1952"/>
+    <w:bookmarkEnd w:id="192"/>
+    <w:bookmarkStart w:id="194" w:name="ref-hodgkin1952"/>
     <w:p>
       <w:pPr>
         <w:pStyle w:val="Bibliography"/>
@@ -23439,7 +23643,7 @@
         </w:rPr>
         <w:t xml:space="preserve"> </w:t>
       </w:r>
-      <w:hyperlink r:id="rId191">
+      <w:hyperlink r:id="rId193">
         <w:r>
           <w:rPr>
             <w:rStyle w:val="Hyperlink"/>
@@ -23449,8 +23653,8 @@
         </w:r>
       </w:hyperlink>
     </w:p>
-    <w:bookmarkEnd w:id="192"/>
-    <w:bookmarkStart w:id="194" w:name="ref-hopfield1982"/>
+    <w:bookmarkEnd w:id="194"/>
+    <w:bookmarkStart w:id="196" w:name="ref-hopfield1982"/>
     <w:p>
       <w:pPr>
         <w:pStyle w:val="Bibliography"/>
@@ -23507,7 +23711,7 @@
         </w:rPr>
         <w:t xml:space="preserve"> </w:t>
       </w:r>
-      <w:hyperlink r:id="rId193">
+      <w:hyperlink r:id="rId195">
         <w:r>
           <w:rPr>
             <w:rStyle w:val="Hyperlink"/>
@@ -23517,8 +23721,8 @@
         </w:r>
       </w:hyperlink>
     </w:p>
-    <w:bookmarkEnd w:id="194"/>
-    <w:bookmarkStart w:id="196" w:name="ref-huang2025"/>
+    <w:bookmarkEnd w:id="196"/>
+    <w:bookmarkStart w:id="198" w:name="ref-huang2025"/>
     <w:p>
       <w:pPr>
         <w:pStyle w:val="Bibliography"/>
@@ -23575,7 +23779,7 @@
         </w:rPr>
         <w:t xml:space="preserve"> </w:t>
       </w:r>
-      <w:hyperlink r:id="rId195">
+      <w:hyperlink r:id="rId197">
         <w:r>
           <w:rPr>
             <w:rStyle w:val="Hyperlink"/>
@@ -23585,8 +23789,8 @@
         </w:r>
       </w:hyperlink>
     </w:p>
-    <w:bookmarkEnd w:id="196"/>
-    <w:bookmarkStart w:id="198" w:name="ref-huang"/>
+    <w:bookmarkEnd w:id="198"/>
+    <w:bookmarkStart w:id="200" w:name="ref-huang"/>
     <w:p>
       <w:pPr>
         <w:pStyle w:val="Bibliography"/>
@@ -23623,7 +23827,7 @@
         </w:rPr>
         <w:t xml:space="preserve"> </w:t>
       </w:r>
-      <w:hyperlink r:id="rId197">
+      <w:hyperlink r:id="rId199">
         <w:r>
           <w:rPr>
             <w:rStyle w:val="Hyperlink"/>
@@ -23633,8 +23837,8 @@
         </w:r>
       </w:hyperlink>
     </w:p>
-    <w:bookmarkEnd w:id="198"/>
-    <w:bookmarkStart w:id="200" w:name="ref-iaccarino2016"/>
+    <w:bookmarkEnd w:id="200"/>
+    <w:bookmarkStart w:id="202" w:name="ref-iaccarino2016"/>
     <w:p>
       <w:pPr>
         <w:pStyle w:val="Bibliography"/>
@@ -23691,7 +23895,7 @@
         </w:rPr>
         <w:t xml:space="preserve"> </w:t>
       </w:r>
-      <w:hyperlink r:id="rId199">
+      <w:hyperlink r:id="rId201">
         <w:r>
           <w:rPr>
             <w:rStyle w:val="Hyperlink"/>
@@ -23701,8 +23905,8 @@
         </w:r>
       </w:hyperlink>
     </w:p>
-    <w:bookmarkEnd w:id="200"/>
-    <w:bookmarkStart w:id="202" w:name="ref-jaeger2001"/>
+    <w:bookmarkEnd w:id="202"/>
+    <w:bookmarkStart w:id="204" w:name="ref-jaeger2001"/>
     <w:p>
       <w:pPr>
         <w:pStyle w:val="Bibliography"/>
@@ -23777,7 +23981,7 @@
         </w:rPr>
         <w:t xml:space="preserve"> </w:t>
       </w:r>
-      <w:hyperlink r:id="rId201">
+      <w:hyperlink r:id="rId203">
         <w:r>
           <w:rPr>
             <w:rStyle w:val="Hyperlink"/>
@@ -23787,8 +23991,8 @@
         </w:r>
       </w:hyperlink>
     </w:p>
-    <w:bookmarkEnd w:id="202"/>
-    <w:bookmarkStart w:id="204" w:name="ref-edm"/>
+    <w:bookmarkEnd w:id="204"/>
+    <w:bookmarkStart w:id="206" w:name="ref-edm"/>
     <w:p>
       <w:pPr>
         <w:pStyle w:val="Bibliography"/>
@@ -23857,7 +24061,7 @@
         </w:rPr>
         <w:t xml:space="preserve"> </w:t>
       </w:r>
-      <w:hyperlink r:id="rId203">
+      <w:hyperlink r:id="rId205">
         <w:r>
           <w:rPr>
             <w:rStyle w:val="Hyperlink"/>
@@ -23867,8 +24071,8 @@
         </w:r>
       </w:hyperlink>
     </w:p>
-    <w:bookmarkEnd w:id="204"/>
-    <w:bookmarkStart w:id="206" w:name="ref-keller2023"/>
+    <w:bookmarkEnd w:id="206"/>
+    <w:bookmarkStart w:id="208" w:name="ref-keller2023"/>
     <w:p>
       <w:pPr>
         <w:pStyle w:val="Bibliography"/>
@@ -23977,7 +24181,7 @@
         </w:rPr>
         <w:t xml:space="preserve"> </w:t>
       </w:r>
-      <w:hyperlink r:id="rId205">
+      <w:hyperlink r:id="rId207">
         <w:r>
           <w:rPr>
             <w:rStyle w:val="Hyperlink"/>
@@ -23987,8 +24191,8 @@
         </w:r>
       </w:hyperlink>
     </w:p>
-    <w:bookmarkEnd w:id="206"/>
-    <w:bookmarkStart w:id="208" w:name="ref-kern2003"/>
+    <w:bookmarkEnd w:id="208"/>
+    <w:bookmarkStart w:id="210" w:name="ref-kern2003"/>
     <w:p>
       <w:pPr>
         <w:pStyle w:val="Bibliography"/>
@@ -24045,7 +24249,7 @@
         </w:rPr>
         <w:t xml:space="preserve"> </w:t>
       </w:r>
-      <w:hyperlink r:id="rId207">
+      <w:hyperlink r:id="rId209">
         <w:r>
           <w:rPr>
             <w:rStyle w:val="Hyperlink"/>
@@ -24055,8 +24259,8 @@
         </w:r>
       </w:hyperlink>
     </w:p>
-    <w:bookmarkEnd w:id="208"/>
-    <w:bookmarkStart w:id="210" w:name="ref-kozachkov2022"/>
+    <w:bookmarkEnd w:id="210"/>
+    <w:bookmarkStart w:id="212" w:name="ref-kozachkov2022"/>
     <w:p>
       <w:pPr>
         <w:pStyle w:val="Bibliography"/>
@@ -24093,7 +24297,7 @@
         </w:rPr>
         <w:t xml:space="preserve"> </w:t>
       </w:r>
-      <w:hyperlink r:id="rId209">
+      <w:hyperlink r:id="rId211">
         <w:r>
           <w:rPr>
             <w:rStyle w:val="Hyperlink"/>
@@ -24103,8 +24307,8 @@
         </w:r>
       </w:hyperlink>
     </w:p>
-    <w:bookmarkEnd w:id="210"/>
-    <w:bookmarkStart w:id="212" w:name="ref-kuramoto1975"/>
+    <w:bookmarkEnd w:id="212"/>
+    <w:bookmarkStart w:id="214" w:name="ref-kuramoto1975"/>
     <w:p>
       <w:pPr>
         <w:pStyle w:val="Bibliography"/>
@@ -24141,7 +24345,7 @@
         </w:rPr>
         <w:t xml:space="preserve"> </w:t>
       </w:r>
-      <w:hyperlink r:id="rId211">
+      <w:hyperlink r:id="rId213">
         <w:r>
           <w:rPr>
             <w:rStyle w:val="Hyperlink"/>
@@ -24151,8 +24355,8 @@
         </w:r>
       </w:hyperlink>
     </w:p>
-    <w:bookmarkEnd w:id="212"/>
-    <w:bookmarkStart w:id="214" w:name="ref-kuramoto2002"/>
+    <w:bookmarkEnd w:id="214"/>
+    <w:bookmarkStart w:id="216" w:name="ref-kuramoto2002"/>
     <w:p>
       <w:pPr>
         <w:pStyle w:val="Bibliography"/>
@@ -24209,7 +24413,7 @@
         </w:rPr>
         <w:t xml:space="preserve"> </w:t>
       </w:r>
-      <w:hyperlink r:id="rId213">
+      <w:hyperlink r:id="rId215">
         <w:r>
           <w:rPr>
             <w:rStyle w:val="Hyperlink"/>
@@ -24219,8 +24423,8 @@
         </w:r>
       </w:hyperlink>
     </w:p>
-    <w:bookmarkEnd w:id="214"/>
-    <w:bookmarkStart w:id="216" w:name="ref-kusmierz2025"/>
+    <w:bookmarkEnd w:id="216"/>
+    <w:bookmarkStart w:id="218" w:name="ref-kusmierz2025"/>
     <w:p>
       <w:pPr>
         <w:pStyle w:val="Bibliography"/>
@@ -24277,7 +24481,7 @@
         </w:rPr>
         <w:t xml:space="preserve"> </w:t>
       </w:r>
-      <w:hyperlink r:id="rId215">
+      <w:hyperlink r:id="rId217">
         <w:r>
           <w:rPr>
             <w:rStyle w:val="Hyperlink"/>
@@ -24287,8 +24491,8 @@
         </w:r>
       </w:hyperlink>
     </w:p>
-    <w:bookmarkEnd w:id="216"/>
-    <w:bookmarkStart w:id="218" w:name="ref-kwon2023"/>
+    <w:bookmarkEnd w:id="218"/>
+    <w:bookmarkStart w:id="220" w:name="ref-kwon2023"/>
     <w:p>
       <w:pPr>
         <w:pStyle w:val="Bibliography"/>
@@ -24357,7 +24561,7 @@
         </w:rPr>
         <w:t xml:space="preserve"> </w:t>
       </w:r>
-      <w:hyperlink r:id="rId217">
+      <w:hyperlink r:id="rId219">
         <w:r>
           <w:rPr>
             <w:rStyle w:val="Hyperlink"/>
@@ -24367,8 +24571,8 @@
         </w:r>
       </w:hyperlink>
     </w:p>
-    <w:bookmarkEnd w:id="218"/>
-    <w:bookmarkStart w:id="220" w:name="ref-kynkaanniemi2019"/>
+    <w:bookmarkEnd w:id="220"/>
+    <w:bookmarkStart w:id="222" w:name="ref-kynkaanniemi2019"/>
     <w:p>
       <w:pPr>
         <w:pStyle w:val="Bibliography"/>
@@ -24437,7 +24641,7 @@
         </w:rPr>
         <w:t xml:space="preserve"> </w:t>
       </w:r>
-      <w:hyperlink r:id="rId219">
+      <w:hyperlink r:id="rId221">
         <w:r>
           <w:rPr>
             <w:rStyle w:val="Hyperlink"/>
@@ -24447,8 +24651,8 @@
         </w:r>
       </w:hyperlink>
     </w:p>
-    <w:bookmarkEnd w:id="220"/>
-    <w:bookmarkStart w:id="222" w:name="ref-landau1944"/>
+    <w:bookmarkEnd w:id="222"/>
+    <w:bookmarkStart w:id="224" w:name="ref-landau1944"/>
     <w:p>
       <w:pPr>
         <w:pStyle w:val="Bibliography"/>
@@ -24491,7 +24695,7 @@
         </w:rPr>
         <w:t xml:space="preserve"> </w:t>
       </w:r>
-      <w:hyperlink r:id="rId221">
+      <w:hyperlink r:id="rId223">
         <w:r>
           <w:rPr>
             <w:rStyle w:val="Hyperlink"/>
@@ -24501,8 +24705,8 @@
         </w:r>
       </w:hyperlink>
     </w:p>
-    <w:bookmarkEnd w:id="222"/>
-    <w:bookmarkStart w:id="224" w:name="ref-lanthaler2023"/>
+    <w:bookmarkEnd w:id="224"/>
+    <w:bookmarkStart w:id="226" w:name="ref-lanthaler2023"/>
     <w:p>
       <w:pPr>
         <w:pStyle w:val="Bibliography"/>
@@ -24571,7 +24775,7 @@
         </w:rPr>
         <w:t xml:space="preserve"> </w:t>
       </w:r>
-      <w:hyperlink r:id="rId223">
+      <w:hyperlink r:id="rId225">
         <w:r>
           <w:rPr>
             <w:rStyle w:val="Hyperlink"/>
@@ -24581,8 +24785,8 @@
         </w:r>
       </w:hyperlink>
     </w:p>
-    <w:bookmarkEnd w:id="224"/>
-    <w:bookmarkStart w:id="226" w:name="ref-lecun1998"/>
+    <w:bookmarkEnd w:id="226"/>
+    <w:bookmarkStart w:id="228" w:name="ref-lecun1998"/>
     <w:p>
       <w:pPr>
         <w:pStyle w:val="Bibliography"/>
@@ -24639,7 +24843,7 @@
         </w:rPr>
         <w:t xml:space="preserve"> </w:t>
       </w:r>
-      <w:hyperlink r:id="rId225">
+      <w:hyperlink r:id="rId227">
         <w:r>
           <w:rPr>
             <w:rStyle w:val="Hyperlink"/>
@@ -24649,8 +24853,8 @@
         </w:r>
       </w:hyperlink>
     </w:p>
-    <w:bookmarkEnd w:id="226"/>
-    <w:bookmarkStart w:id="228" w:name="ref-lieber2024"/>
+    <w:bookmarkEnd w:id="228"/>
+    <w:bookmarkStart w:id="230" w:name="ref-lieber2024"/>
     <w:p>
       <w:pPr>
         <w:pStyle w:val="Bibliography"/>
@@ -24687,7 +24891,7 @@
         </w:rPr>
         <w:t xml:space="preserve"> </w:t>
       </w:r>
-      <w:hyperlink r:id="rId227">
+      <w:hyperlink r:id="rId229">
         <w:r>
           <w:rPr>
             <w:rStyle w:val="Hyperlink"/>
@@ -24697,8 +24901,8 @@
         </w:r>
       </w:hyperlink>
     </w:p>
-    <w:bookmarkEnd w:id="228"/>
-    <w:bookmarkStart w:id="230" w:name="ref-litwin-kumar2012"/>
+    <w:bookmarkEnd w:id="230"/>
+    <w:bookmarkStart w:id="232" w:name="ref-litwin-kumar2012"/>
     <w:p>
       <w:pPr>
         <w:pStyle w:val="Bibliography"/>
@@ -24755,7 +24959,7 @@
         </w:rPr>
         <w:t xml:space="preserve"> </w:t>
       </w:r>
-      <w:hyperlink r:id="rId229">
+      <w:hyperlink r:id="rId231">
         <w:r>
           <w:rPr>
             <w:rStyle w:val="Hyperlink"/>
@@ -24765,8 +24969,8 @@
         </w:r>
       </w:hyperlink>
     </w:p>
-    <w:bookmarkEnd w:id="230"/>
-    <w:bookmarkStart w:id="232" w:name="ref-murenn"/>
+    <w:bookmarkEnd w:id="232"/>
+    <w:bookmarkStart w:id="234" w:name="ref-murenn"/>
     <w:p>
       <w:pPr>
         <w:pStyle w:val="Bibliography"/>
@@ -24851,7 +25055,7 @@
         </w:rPr>
         <w:t xml:space="preserve"> </w:t>
       </w:r>
-      <w:hyperlink r:id="rId231">
+      <w:hyperlink r:id="rId233">
         <w:r>
           <w:rPr>
             <w:rStyle w:val="Hyperlink"/>
@@ -24861,8 +25065,8 @@
         </w:r>
       </w:hyperlink>
     </w:p>
-    <w:bookmarkEnd w:id="232"/>
-    <w:bookmarkStart w:id="234" w:name="ref-lukosevicius2009"/>
+    <w:bookmarkEnd w:id="234"/>
+    <w:bookmarkStart w:id="236" w:name="ref-lukosevicius2009"/>
     <w:p>
       <w:pPr>
         <w:pStyle w:val="Bibliography"/>
@@ -24919,7 +25123,7 @@
         </w:rPr>
         <w:t xml:space="preserve"> </w:t>
       </w:r>
-      <w:hyperlink r:id="rId233">
+      <w:hyperlink r:id="rId235">
         <w:r>
           <w:rPr>
             <w:rStyle w:val="Hyperlink"/>
@@ -24929,8 +25133,8 @@
         </w:r>
       </w:hyperlink>
     </w:p>
-    <w:bookmarkEnd w:id="234"/>
-    <w:bookmarkStart w:id="236" w:name="ref-maass2002"/>
+    <w:bookmarkEnd w:id="236"/>
+    <w:bookmarkStart w:id="238" w:name="ref-maass2002"/>
     <w:p>
       <w:pPr>
         <w:pStyle w:val="Bibliography"/>
@@ -24987,7 +25191,7 @@
         </w:rPr>
         <w:t xml:space="preserve"> </w:t>
       </w:r>
-      <w:hyperlink r:id="rId235">
+      <w:hyperlink r:id="rId237">
         <w:r>
           <w:rPr>
             <w:rStyle w:val="Hyperlink"/>
@@ -24997,8 +25201,8 @@
         </w:r>
       </w:hyperlink>
     </w:p>
-    <w:bookmarkEnd w:id="236"/>
-    <w:bookmarkStart w:id="238" w:name="ref-mead1990"/>
+    <w:bookmarkEnd w:id="238"/>
+    <w:bookmarkStart w:id="240" w:name="ref-mead1990"/>
     <w:p>
       <w:pPr>
         <w:pStyle w:val="Bibliography"/>
@@ -25055,7 +25259,7 @@
         </w:rPr>
         <w:t xml:space="preserve"> </w:t>
       </w:r>
-      <w:hyperlink r:id="rId237">
+      <w:hyperlink r:id="rId239">
         <w:r>
           <w:rPr>
             <w:rStyle w:val="Hyperlink"/>
@@ -25065,8 +25269,8 @@
         </w:r>
       </w:hyperlink>
     </w:p>
-    <w:bookmarkEnd w:id="238"/>
-    <w:bookmarkStart w:id="240" w:name="ref-leaf-apcen"/>
+    <w:bookmarkEnd w:id="240"/>
+    <w:bookmarkStart w:id="242" w:name="ref-leaf-apcen"/>
     <w:p>
       <w:pPr>
         <w:pStyle w:val="Bibliography"/>
@@ -25151,7 +25355,7 @@
         </w:rPr>
         <w:t xml:space="preserve"> </w:t>
       </w:r>
-      <w:hyperlink r:id="rId239">
+      <w:hyperlink r:id="rId241">
         <w:r>
           <w:rPr>
             <w:rStyle w:val="Hyperlink"/>
@@ -25161,8 +25365,8 @@
         </w:r>
       </w:hyperlink>
     </w:p>
-    <w:bookmarkEnd w:id="240"/>
-    <w:bookmarkStart w:id="242" w:name="ref-millan2020"/>
+    <w:bookmarkEnd w:id="242"/>
+    <w:bookmarkStart w:id="244" w:name="ref-millan2020"/>
     <w:p>
       <w:pPr>
         <w:pStyle w:val="Bibliography"/>
@@ -25219,7 +25423,7 @@
         </w:rPr>
         <w:t xml:space="preserve"> </w:t>
       </w:r>
-      <w:hyperlink r:id="rId241">
+      <w:hyperlink r:id="rId243">
         <w:r>
           <w:rPr>
             <w:rStyle w:val="Hyperlink"/>
@@ -25229,8 +25433,8 @@
         </w:r>
       </w:hyperlink>
     </w:p>
-    <w:bookmarkEnd w:id="242"/>
-    <w:bookmarkStart w:id="244" w:name="ref-milling2026"/>
+    <w:bookmarkEnd w:id="244"/>
+    <w:bookmarkStart w:id="246" w:name="ref-milling2026"/>
     <w:p>
       <w:pPr>
         <w:pStyle w:val="Bibliography"/>
@@ -25287,7 +25491,7 @@
         </w:rPr>
         <w:t xml:space="preserve"> </w:t>
       </w:r>
-      <w:hyperlink r:id="rId243">
+      <w:hyperlink r:id="rId245">
         <w:r>
           <w:rPr>
             <w:rStyle w:val="Hyperlink"/>
@@ -25297,8 +25501,8 @@
         </w:r>
       </w:hyperlink>
     </w:p>
-    <w:bookmarkEnd w:id="244"/>
-    <w:bookmarkStart w:id="246" w:name="ref-akorn"/>
+    <w:bookmarkEnd w:id="246"/>
+    <w:bookmarkStart w:id="248" w:name="ref-akorn"/>
     <w:p>
       <w:pPr>
         <w:pStyle w:val="Bibliography"/>
@@ -25367,7 +25571,7 @@
         </w:rPr>
         <w:t xml:space="preserve"> </w:t>
       </w:r>
-      <w:hyperlink r:id="rId245">
+      <w:hyperlink r:id="rId247">
         <w:r>
           <w:rPr>
             <w:rStyle w:val="Hyperlink"/>
@@ -25377,8 +25581,8 @@
         </w:r>
       </w:hyperlink>
     </w:p>
-    <w:bookmarkEnd w:id="246"/>
-    <w:bookmarkStart w:id="248" w:name="ref-morris1981"/>
+    <w:bookmarkEnd w:id="248"/>
+    <w:bookmarkStart w:id="250" w:name="ref-morris1981"/>
     <w:p>
       <w:pPr>
         <w:pStyle w:val="Bibliography"/>
@@ -25435,7 +25639,7 @@
         </w:rPr>
         <w:t xml:space="preserve"> </w:t>
       </w:r>
-      <w:hyperlink r:id="rId247">
+      <w:hyperlink r:id="rId249">
         <w:r>
           <w:rPr>
             <w:rStyle w:val="Hyperlink"/>
@@ -25445,8 +25649,8 @@
         </w:r>
       </w:hyperlink>
     </w:p>
-    <w:bookmarkEnd w:id="248"/>
-    <w:bookmarkStart w:id="250" w:name="ref-mulas2020"/>
+    <w:bookmarkEnd w:id="250"/>
+    <w:bookmarkStart w:id="252" w:name="ref-mulas2020"/>
     <w:p>
       <w:pPr>
         <w:pStyle w:val="Bibliography"/>
@@ -25503,7 +25707,7 @@
         </w:rPr>
         <w:t xml:space="preserve"> </w:t>
       </w:r>
-      <w:hyperlink r:id="rId249">
+      <w:hyperlink r:id="rId251">
         <w:r>
           <w:rPr>
             <w:rStyle w:val="Hyperlink"/>
@@ -25513,8 +25717,8 @@
         </w:r>
       </w:hyperlink>
     </w:p>
-    <w:bookmarkEnd w:id="250"/>
-    <w:bookmarkStart w:id="252" w:name="ref-muzellec2025"/>
+    <w:bookmarkEnd w:id="252"/>
+    <w:bookmarkStart w:id="254" w:name="ref-muzellec2025"/>
     <w:p>
       <w:pPr>
         <w:pStyle w:val="Bibliography"/>
@@ -25551,7 +25755,7 @@
         </w:rPr>
         <w:t xml:space="preserve"> </w:t>
       </w:r>
-      <w:hyperlink r:id="rId251">
+      <w:hyperlink r:id="rId253">
         <w:r>
           <w:rPr>
             <w:rStyle w:val="Hyperlink"/>
@@ -25561,8 +25765,8 @@
         </w:r>
       </w:hyperlink>
     </w:p>
-    <w:bookmarkEnd w:id="252"/>
-    <w:bookmarkStart w:id="254" w:name="ref-nagerl2025"/>
+    <w:bookmarkEnd w:id="254"/>
+    <w:bookmarkStart w:id="256" w:name="ref-nagerl2025"/>
     <w:p>
       <w:pPr>
         <w:pStyle w:val="Bibliography"/>
@@ -25599,7 +25803,7 @@
         </w:rPr>
         <w:t xml:space="preserve"> </w:t>
       </w:r>
-      <w:hyperlink r:id="rId253">
+      <w:hyperlink r:id="rId255">
         <w:r>
           <w:rPr>
             <w:rStyle w:val="Hyperlink"/>
@@ -25609,8 +25813,8 @@
         </w:r>
       </w:hyperlink>
     </w:p>
-    <w:bookmarkEnd w:id="254"/>
-    <w:bookmarkStart w:id="256" w:name="ref-neftci2019"/>
+    <w:bookmarkEnd w:id="256"/>
+    <w:bookmarkStart w:id="258" w:name="ref-neftci2019"/>
     <w:p>
       <w:pPr>
         <w:pStyle w:val="Bibliography"/>
@@ -25667,7 +25871,7 @@
         </w:rPr>
         <w:t xml:space="preserve"> </w:t>
       </w:r>
-      <w:hyperlink r:id="rId255">
+      <w:hyperlink r:id="rId257">
         <w:r>
           <w:rPr>
             <w:rStyle w:val="Hyperlink"/>
@@ -25677,8 +25881,8 @@
         </w:r>
       </w:hyperlink>
     </w:p>
-    <w:bookmarkEnd w:id="256"/>
-    <w:bookmarkStart w:id="258" w:name="ref-nunley2026"/>
+    <w:bookmarkEnd w:id="258"/>
+    <w:bookmarkStart w:id="260" w:name="ref-nunley2026"/>
     <w:p>
       <w:pPr>
         <w:pStyle w:val="Bibliography"/>
@@ -25715,7 +25919,7 @@
         </w:rPr>
         <w:t xml:space="preserve"> </w:t>
       </w:r>
-      <w:hyperlink r:id="rId257">
+      <w:hyperlink r:id="rId259">
         <w:r>
           <w:rPr>
             <w:rStyle w:val="Hyperlink"/>
@@ -25725,8 +25929,8 @@
         </w:r>
       </w:hyperlink>
     </w:p>
-    <w:bookmarkEnd w:id="258"/>
-    <w:bookmarkStart w:id="260" w:name="ref-kuramoto-attention"/>
+    <w:bookmarkEnd w:id="260"/>
+    <w:bookmarkStart w:id="262" w:name="ref-kuramoto-attention"/>
     <w:p>
       <w:pPr>
         <w:pStyle w:val="Bibliography"/>
@@ -25763,7 +25967,7 @@
         </w:rPr>
         <w:t xml:space="preserve"> </w:t>
       </w:r>
-      <w:hyperlink r:id="rId259">
+      <w:hyperlink r:id="rId261">
         <w:r>
           <w:rPr>
             <w:rStyle w:val="Hyperlink"/>
@@ -25773,8 +25977,8 @@
         </w:r>
       </w:hyperlink>
     </w:p>
-    <w:bookmarkEnd w:id="260"/>
-    <w:bookmarkStart w:id="262" w:name="ref-o-keeffe2019"/>
+    <w:bookmarkEnd w:id="262"/>
+    <w:bookmarkStart w:id="264" w:name="ref-o-keeffe2019"/>
     <w:p>
       <w:pPr>
         <w:pStyle w:val="Bibliography"/>
@@ -25827,7 +26031,7 @@
         </w:rPr>
         <w:t xml:space="preserve"> </w:t>
       </w:r>
-      <w:hyperlink r:id="rId261">
+      <w:hyperlink r:id="rId263">
         <w:r>
           <w:rPr>
             <w:rStyle w:val="Hyperlink"/>
@@ -25837,8 +26041,8 @@
         </w:r>
       </w:hyperlink>
     </w:p>
-    <w:bookmarkEnd w:id="262"/>
-    <w:bookmarkStart w:id="264" w:name="ref-pantaleone2002"/>
+    <w:bookmarkEnd w:id="264"/>
+    <w:bookmarkStart w:id="266" w:name="ref-pantaleone2002"/>
     <w:p>
       <w:pPr>
         <w:pStyle w:val="Bibliography"/>
@@ -25895,7 +26099,7 @@
         </w:rPr>
         <w:t xml:space="preserve"> </w:t>
       </w:r>
-      <w:hyperlink r:id="rId263">
+      <w:hyperlink r:id="rId265">
         <w:r>
           <w:rPr>
             <w:rStyle w:val="Hyperlink"/>
@@ -25905,8 +26109,8 @@
         </w:r>
       </w:hyperlink>
     </w:p>
-    <w:bookmarkEnd w:id="264"/>
-    <w:bookmarkStart w:id="266" w:name="ref-pikovsky2001"/>
+    <w:bookmarkEnd w:id="266"/>
+    <w:bookmarkStart w:id="268" w:name="ref-peng2023"/>
     <w:p>
       <w:pPr>
         <w:pStyle w:val="Bibliography"/>
@@ -25915,6 +26119,128 @@
         <w:rPr>
           <w:lang w:val="en-GB"/>
         </w:rPr>
+        <w:t xml:space="preserve">Peng, B., Alcaide, E., Anthony, Q., Albalak, A., Arcadinho, S., Biderman, S., Cao, H., Cheng, X., Chung, M., Derczynski, L., Du, X., Grella, M., Gv, K., He, X., Hou, H., Kazienko, P., Kocon, J., Kong, J., Koptyra, B., … Zhu, R.-J. (2023).</w:t>
+      </w:r>
+      <w:r>
+        <w:rPr>
+          <w:lang w:val="en-GB"/>
+        </w:rPr>
+        <w:t xml:space="preserve"> </w:t>
+      </w:r>
+      <w:r>
+        <w:rPr>
+          <w:lang w:val="en-GB"/>
+        </w:rPr>
+        <w:t xml:space="preserve">RWKV</w:t>
+      </w:r>
+      <w:r>
+        <w:rPr>
+          <w:lang w:val="en-GB"/>
+        </w:rPr>
+        <w:t xml:space="preserve">: Reinventing</w:t>
+      </w:r>
+      <w:r>
+        <w:rPr>
+          <w:lang w:val="en-GB"/>
+        </w:rPr>
+        <w:t xml:space="preserve"> </w:t>
+      </w:r>
+      <w:r>
+        <w:rPr>
+          <w:lang w:val="en-GB"/>
+        </w:rPr>
+        <w:t xml:space="preserve">RNNs</w:t>
+      </w:r>
+      <w:r>
+        <w:rPr>
+          <w:lang w:val="en-GB"/>
+        </w:rPr>
+        <w:t xml:space="preserve"> </w:t>
+      </w:r>
+      <w:r>
+        <w:rPr>
+          <w:lang w:val="en-GB"/>
+        </w:rPr>
+        <w:t xml:space="preserve">for the transformer era.</w:t>
+      </w:r>
+      <w:r>
+        <w:rPr>
+          <w:lang w:val="en-GB"/>
+        </w:rPr>
+        <w:t xml:space="preserve"> </w:t>
+      </w:r>
+      <w:r>
+        <w:rPr>
+          <w:i/>
+          <w:iCs/>
+          <w:lang w:val="en-GB"/>
+        </w:rPr>
+        <w:t xml:space="preserve">Findings of the Association for Computational Linguistics:</w:t>
+      </w:r>
+      <w:r>
+        <w:rPr>
+          <w:i/>
+          <w:iCs/>
+          <w:lang w:val="en-GB"/>
+        </w:rPr>
+        <w:t xml:space="preserve"> </w:t>
+      </w:r>
+      <w:r>
+        <w:rPr>
+          <w:i/>
+          <w:iCs/>
+          <w:lang w:val="en-GB"/>
+        </w:rPr>
+        <w:t xml:space="preserve">EMNLP</w:t>
+      </w:r>
+      <w:r>
+        <w:rPr>
+          <w:i/>
+          <w:iCs/>
+          <w:lang w:val="en-GB"/>
+        </w:rPr>
+        <w:t xml:space="preserve"> </w:t>
+      </w:r>
+      <w:r>
+        <w:rPr>
+          <w:i/>
+          <w:iCs/>
+          <w:lang w:val="en-GB"/>
+        </w:rPr>
+        <w:t xml:space="preserve">2023, Singapore, December 6-10, 2023</w:t>
+      </w:r>
+      <w:r>
+        <w:rPr>
+          <w:lang w:val="en-GB"/>
+        </w:rPr>
+        <w:t xml:space="preserve">, 14048–14077.</w:t>
+      </w:r>
+      <w:r>
+        <w:rPr>
+          <w:lang w:val="en-GB"/>
+        </w:rPr>
+        <w:t xml:space="preserve"> </w:t>
+      </w:r>
+      <w:hyperlink r:id="rId267">
+        <w:r>
+          <w:rPr>
+            <w:rStyle w:val="Hyperlink"/>
+            <w:lang w:val="en-GB"/>
+          </w:rPr>
+          <w:t xml:space="preserve">https://doi.org/10.18653/v1/2023.findings-emnlp.936</w:t>
+        </w:r>
+      </w:hyperlink>
+    </w:p>
+    <w:bookmarkEnd w:id="268"/>
+    <w:bookmarkStart w:id="270" w:name="ref-pikovsky2001"/>
+    <w:p>
+      <w:pPr>
+        <w:pStyle w:val="Bibliography"/>
+      </w:pPr>
+      <w:r>
+        <w:rPr>
+          <w:lang w:val="en-GB"/>
+        </w:rPr>
         <w:t xml:space="preserve">Pikovsky, A., Rosenblum, M., &amp; Kurths, J. (2001).</w:t>
       </w:r>
       <w:r>
@@ -25943,7 +26269,7 @@
         </w:rPr>
         <w:t xml:space="preserve"> </w:t>
       </w:r>
-      <w:hyperlink r:id="rId265">
+      <w:hyperlink r:id="rId269">
         <w:r>
           <w:rPr>
             <w:rStyle w:val="Hyperlink"/>
@@ -25953,8 +26279,8 @@
         </w:r>
       </w:hyperlink>
     </w:p>
-    <w:bookmarkEnd w:id="266"/>
-    <w:bookmarkStart w:id="268" w:name="ref-pittman-polletta2021"/>
+    <w:bookmarkEnd w:id="270"/>
+    <w:bookmarkStart w:id="272" w:name="ref-pittman-polletta2021"/>
     <w:p>
       <w:pPr>
         <w:pStyle w:val="Bibliography"/>
@@ -26011,7 +26337,7 @@
         </w:rPr>
         <w:t xml:space="preserve"> </w:t>
       </w:r>
-      <w:hyperlink r:id="rId267">
+      <w:hyperlink r:id="rId271">
         <w:r>
           <w:rPr>
             <w:rStyle w:val="Hyperlink"/>
@@ -26021,8 +26347,8 @@
         </w:r>
       </w:hyperlink>
     </w:p>
-    <w:bookmarkEnd w:id="268"/>
-    <w:bookmarkStart w:id="270" w:name="ref-poppel2026"/>
+    <w:bookmarkEnd w:id="272"/>
+    <w:bookmarkStart w:id="274" w:name="ref-poppel2026"/>
     <w:p>
       <w:pPr>
         <w:pStyle w:val="Bibliography"/>
@@ -26059,7 +26385,7 @@
         </w:rPr>
         <w:t xml:space="preserve"> </w:t>
       </w:r>
-      <w:hyperlink r:id="rId269">
+      <w:hyperlink r:id="rId273">
         <w:r>
           <w:rPr>
             <w:rStyle w:val="Hyperlink"/>
@@ -26069,8 +26395,8 @@
         </w:r>
       </w:hyperlink>
     </w:p>
-    <w:bookmarkEnd w:id="270"/>
-    <w:bookmarkStart w:id="272" w:name="ref-rivera-sierra2026"/>
+    <w:bookmarkEnd w:id="274"/>
+    <w:bookmarkStart w:id="276" w:name="ref-rivera-sierra2026"/>
     <w:p>
       <w:pPr>
         <w:pStyle w:val="Bibliography"/>
@@ -26127,7 +26453,7 @@
         </w:rPr>
         <w:t xml:space="preserve"> </w:t>
       </w:r>
-      <w:hyperlink r:id="rId271">
+      <w:hyperlink r:id="rId275">
         <w:r>
           <w:rPr>
             <w:rStyle w:val="Hyperlink"/>
@@ -26137,8 +26463,8 @@
         </w:r>
       </w:hyperlink>
     </w:p>
-    <w:bookmarkEnd w:id="272"/>
-    <w:bookmarkStart w:id="274" w:name="ref-rodan2011"/>
+    <w:bookmarkEnd w:id="276"/>
+    <w:bookmarkStart w:id="278" w:name="ref-rodan2011"/>
     <w:p>
       <w:pPr>
         <w:pStyle w:val="Bibliography"/>
@@ -26195,7 +26521,7 @@
         </w:rPr>
         <w:t xml:space="preserve"> </w:t>
       </w:r>
-      <w:hyperlink r:id="rId273">
+      <w:hyperlink r:id="rId277">
         <w:r>
           <w:rPr>
             <w:rStyle w:val="Hyperlink"/>
@@ -26205,8 +26531,8 @@
         </w:r>
       </w:hyperlink>
     </w:p>
-    <w:bookmarkEnd w:id="274"/>
-    <w:bookmarkStart w:id="276" w:name="ref-rusch2021"/>
+    <w:bookmarkEnd w:id="278"/>
+    <w:bookmarkStart w:id="280" w:name="ref-rusch2021"/>
     <w:p>
       <w:pPr>
         <w:pStyle w:val="Bibliography"/>
@@ -26275,7 +26601,7 @@
         </w:rPr>
         <w:t xml:space="preserve"> </w:t>
       </w:r>
-      <w:hyperlink r:id="rId275">
+      <w:hyperlink r:id="rId279">
         <w:r>
           <w:rPr>
             <w:rStyle w:val="Hyperlink"/>
@@ -26285,8 +26611,8 @@
         </w:r>
       </w:hyperlink>
     </w:p>
-    <w:bookmarkEnd w:id="276"/>
-    <w:bookmarkStart w:id="278" w:name="ref-unicornn"/>
+    <w:bookmarkEnd w:id="280"/>
+    <w:bookmarkStart w:id="282" w:name="ref-unicornn"/>
     <w:p>
       <w:pPr>
         <w:pStyle w:val="Bibliography"/>
@@ -26375,7 +26701,7 @@
         </w:rPr>
         <w:t xml:space="preserve"> </w:t>
       </w:r>
-      <w:hyperlink r:id="rId277">
+      <w:hyperlink r:id="rId281">
         <w:r>
           <w:rPr>
             <w:rStyle w:val="Hyperlink"/>
@@ -26385,8 +26711,8 @@
         </w:r>
       </w:hyperlink>
     </w:p>
-    <w:bookmarkEnd w:id="278"/>
-    <w:bookmarkStart w:id="280" w:name="ref-rusch2025"/>
+    <w:bookmarkEnd w:id="282"/>
+    <w:bookmarkStart w:id="284" w:name="ref-rusch2025"/>
     <w:p>
       <w:pPr>
         <w:pStyle w:val="Bibliography"/>
@@ -26455,7 +26781,7 @@
         </w:rPr>
         <w:t xml:space="preserve"> </w:t>
       </w:r>
-      <w:hyperlink r:id="rId279">
+      <w:hyperlink r:id="rId283">
         <w:r>
           <w:rPr>
             <w:rStyle w:val="Hyperlink"/>
@@ -26465,8 +26791,8 @@
         </w:r>
       </w:hyperlink>
     </w:p>
-    <w:bookmarkEnd w:id="280"/>
-    <w:bookmarkStart w:id="282" w:name="ref-sagodi"/>
+    <w:bookmarkEnd w:id="284"/>
+    <w:bookmarkStart w:id="286" w:name="ref-sagodi"/>
     <w:p>
       <w:pPr>
         <w:pStyle w:val="Bibliography"/>
@@ -26503,7 +26829,7 @@
         </w:rPr>
         <w:t xml:space="preserve"> </w:t>
       </w:r>
-      <w:hyperlink r:id="rId281">
+      <w:hyperlink r:id="rId285">
         <w:r>
           <w:rPr>
             <w:rStyle w:val="Hyperlink"/>
@@ -26513,8 +26839,8 @@
         </w:r>
       </w:hyperlink>
     </w:p>
-    <w:bookmarkEnd w:id="282"/>
-    <w:bookmarkStart w:id="284" w:name="ref-sajjadi2018"/>
+    <w:bookmarkEnd w:id="286"/>
+    <w:bookmarkStart w:id="288" w:name="ref-sajjadi2018"/>
     <w:p>
       <w:pPr>
         <w:pStyle w:val="Bibliography"/>
@@ -26583,7 +26909,7 @@
         </w:rPr>
         <w:t xml:space="preserve"> </w:t>
       </w:r>
-      <w:hyperlink r:id="rId283">
+      <w:hyperlink r:id="rId287">
         <w:r>
           <w:rPr>
             <w:rStyle w:val="Hyperlink"/>
@@ -26593,8 +26919,8 @@
         </w:r>
       </w:hyperlink>
     </w:p>
-    <w:bookmarkEnd w:id="284"/>
-    <w:bookmarkStart w:id="286" w:name="ref-sakaguchi1986"/>
+    <w:bookmarkEnd w:id="288"/>
+    <w:bookmarkStart w:id="290" w:name="ref-sakaguchi1986"/>
     <w:p>
       <w:pPr>
         <w:pStyle w:val="Bibliography"/>
@@ -26651,7 +26977,7 @@
         </w:rPr>
         <w:t xml:space="preserve"> </w:t>
       </w:r>
-      <w:hyperlink r:id="rId285">
+      <w:hyperlink r:id="rId289">
         <w:r>
           <w:rPr>
             <w:rStyle w:val="Hyperlink"/>
@@ -26661,8 +26987,8 @@
         </w:r>
       </w:hyperlink>
     </w:p>
-    <w:bookmarkEnd w:id="286"/>
-    <w:bookmarkStart w:id="288" w:name="ref-sasikumar2026"/>
+    <w:bookmarkEnd w:id="290"/>
+    <w:bookmarkStart w:id="292" w:name="ref-sasikumar2026"/>
     <w:p>
       <w:pPr>
         <w:pStyle w:val="Bibliography"/>
@@ -26719,7 +27045,7 @@
         </w:rPr>
         <w:t xml:space="preserve"> </w:t>
       </w:r>
-      <w:hyperlink r:id="rId287">
+      <w:hyperlink r:id="rId291">
         <w:r>
           <w:rPr>
             <w:rStyle w:val="Hyperlink"/>
@@ -26729,8 +27055,8 @@
         </w:r>
       </w:hyperlink>
     </w:p>
-    <w:bookmarkEnd w:id="288"/>
-    <w:bookmarkStart w:id="290" w:name="ref-schuster1989"/>
+    <w:bookmarkEnd w:id="292"/>
+    <w:bookmarkStart w:id="294" w:name="ref-schuster1989"/>
     <w:p>
       <w:pPr>
         <w:pStyle w:val="Bibliography"/>
@@ -26787,7 +27113,7 @@
         </w:rPr>
         <w:t xml:space="preserve"> </w:t>
       </w:r>
-      <w:hyperlink r:id="rId289">
+      <w:hyperlink r:id="rId293">
         <w:r>
           <w:rPr>
             <w:rStyle w:val="Hyperlink"/>
@@ -26797,8 +27123,8 @@
         </w:r>
       </w:hyperlink>
     </w:p>
-    <w:bookmarkEnd w:id="290"/>
-    <w:bookmarkStart w:id="292" w:name="ref-skardal2019"/>
+    <w:bookmarkEnd w:id="294"/>
+    <w:bookmarkStart w:id="296" w:name="ref-skardal2019"/>
     <w:p>
       <w:pPr>
         <w:pStyle w:val="Bibliography"/>
@@ -26855,7 +27181,7 @@
         </w:rPr>
         <w:t xml:space="preserve"> </w:t>
       </w:r>
-      <w:hyperlink r:id="rId291">
+      <w:hyperlink r:id="rId295">
         <w:r>
           <w:rPr>
             <w:rStyle w:val="Hyperlink"/>
@@ -26865,8 +27191,8 @@
         </w:r>
       </w:hyperlink>
     </w:p>
-    <w:bookmarkEnd w:id="292"/>
-    <w:bookmarkStart w:id="294" w:name="ref-kuramoto-orientation-diffusion"/>
+    <w:bookmarkEnd w:id="296"/>
+    <w:bookmarkStart w:id="298" w:name="ref-sohl-dickstein2015"/>
     <w:p>
       <w:pPr>
         <w:pStyle w:val="Bibliography"/>
@@ -26875,6 +27201,106 @@
         <w:rPr>
           <w:lang w:val="en-GB"/>
         </w:rPr>
+        <w:t xml:space="preserve">Sohl-Dickstein, J., Weiss, E. A., Maheswaranathan, N., &amp; Ganguli, S. (2015). Deep unsupervised learning using nonequilibrium thermodynamics.</w:t>
+      </w:r>
+      <w:r>
+        <w:rPr>
+          <w:lang w:val="en-GB"/>
+        </w:rPr>
+        <w:t xml:space="preserve"> </w:t>
+      </w:r>
+      <w:r>
+        <w:rPr>
+          <w:i/>
+          <w:iCs/>
+          <w:lang w:val="en-GB"/>
+        </w:rPr>
+        <w:t xml:space="preserve">Proceedings of the 32nd International Conference on Machine Learning,</w:t>
+      </w:r>
+      <w:r>
+        <w:rPr>
+          <w:i/>
+          <w:iCs/>
+          <w:lang w:val="en-GB"/>
+        </w:rPr>
+        <w:t xml:space="preserve"> </w:t>
+      </w:r>
+      <w:r>
+        <w:rPr>
+          <w:i/>
+          <w:iCs/>
+          <w:lang w:val="en-GB"/>
+        </w:rPr>
+        <w:t xml:space="preserve">ICML</w:t>
+      </w:r>
+      <w:r>
+        <w:rPr>
+          <w:i/>
+          <w:iCs/>
+          <w:lang w:val="en-GB"/>
+        </w:rPr>
+        <w:t xml:space="preserve"> </w:t>
+      </w:r>
+      <w:r>
+        <w:rPr>
+          <w:i/>
+          <w:iCs/>
+          <w:lang w:val="en-GB"/>
+        </w:rPr>
+        <w:t xml:space="preserve">2015, Lille, France, 6-11 July 2015, Proceedings of Machine Learning Research</w:t>
+      </w:r>
+      <w:r>
+        <w:rPr>
+          <w:lang w:val="en-GB"/>
+        </w:rPr>
+        <w:t xml:space="preserve">,</w:t>
+      </w:r>
+      <w:r>
+        <w:rPr>
+          <w:lang w:val="en-GB"/>
+        </w:rPr>
+        <w:t xml:space="preserve"> </w:t>
+      </w:r>
+      <w:r>
+        <w:rPr>
+          <w:i/>
+          <w:iCs/>
+          <w:lang w:val="en-GB"/>
+        </w:rPr>
+        <w:t xml:space="preserve">37</w:t>
+      </w:r>
+      <w:r>
+        <w:rPr>
+          <w:lang w:val="en-GB"/>
+        </w:rPr>
+        <w:t xml:space="preserve">, 2256–2265.</w:t>
+      </w:r>
+      <w:r>
+        <w:rPr>
+          <w:lang w:val="en-GB"/>
+        </w:rPr>
+        <w:t xml:space="preserve"> </w:t>
+      </w:r>
+      <w:hyperlink r:id="rId297">
+        <w:r>
+          <w:rPr>
+            <w:rStyle w:val="Hyperlink"/>
+            <w:lang w:val="en-GB"/>
+          </w:rPr>
+          <w:t xml:space="preserve">https://proceedings.mlr.press/v37/sohl-dickstein15.html</w:t>
+        </w:r>
+      </w:hyperlink>
+    </w:p>
+    <w:bookmarkEnd w:id="298"/>
+    <w:bookmarkStart w:id="300" w:name="ref-kuramoto-orientation-diffusion"/>
+    <w:p>
+      <w:pPr>
+        <w:pStyle w:val="Bibliography"/>
+      </w:pPr>
+      <w:r>
+        <w:rPr>
+          <w:lang w:val="en-GB"/>
+        </w:rPr>
         <w:t xml:space="preserve">Song, Y., Keller, T. A., Brodjian, S., Miyato, T., Yue, Y., Perona, P., &amp; Welling, M. (2025). Kuramoto orientation diffusion models.</w:t>
       </w:r>
       <w:r>
@@ -26935,7 +27361,7 @@
         </w:rPr>
         <w:t xml:space="preserve"> </w:t>
       </w:r>
-      <w:hyperlink r:id="rId293">
+      <w:hyperlink r:id="rId299">
         <w:r>
           <w:rPr>
             <w:rStyle w:val="Hyperlink"/>
@@ -26945,8 +27371,8 @@
         </w:r>
       </w:hyperlink>
     </w:p>
-    <w:bookmarkEnd w:id="294"/>
-    <w:bookmarkStart w:id="296" w:name="ref-stiefel2016"/>
+    <w:bookmarkEnd w:id="300"/>
+    <w:bookmarkStart w:id="302" w:name="ref-stiefel2016"/>
     <w:p>
       <w:pPr>
         <w:pStyle w:val="Bibliography"/>
@@ -27003,7 +27429,7 @@
         </w:rPr>
         <w:t xml:space="preserve"> </w:t>
       </w:r>
-      <w:hyperlink r:id="rId295">
+      <w:hyperlink r:id="rId301">
         <w:r>
           <w:rPr>
             <w:rStyle w:val="Hyperlink"/>
@@ -27013,8 +27439,8 @@
         </w:r>
       </w:hyperlink>
     </w:p>
-    <w:bookmarkEnd w:id="296"/>
-    <w:bookmarkStart w:id="298" w:name="ref-stolzle2024"/>
+    <w:bookmarkEnd w:id="302"/>
+    <w:bookmarkStart w:id="304" w:name="ref-stolzle2024"/>
     <w:p>
       <w:pPr>
         <w:pStyle w:val="Bibliography"/>
@@ -27083,7 +27509,7 @@
         </w:rPr>
         <w:t xml:space="preserve"> </w:t>
       </w:r>
-      <w:hyperlink r:id="rId297">
+      <w:hyperlink r:id="rId303">
         <w:r>
           <w:rPr>
             <w:rStyle w:val="Hyperlink"/>
@@ -27093,8 +27519,8 @@
         </w:r>
       </w:hyperlink>
     </w:p>
-    <w:bookmarkEnd w:id="298"/>
-    <w:bookmarkStart w:id="300" w:name="ref-strogatz2000"/>
+    <w:bookmarkEnd w:id="304"/>
+    <w:bookmarkStart w:id="306" w:name="ref-strogatz2000"/>
     <w:p>
       <w:pPr>
         <w:pStyle w:val="Bibliography"/>
@@ -27151,7 +27577,7 @@
         </w:rPr>
         <w:t xml:space="preserve"> </w:t>
       </w:r>
-      <w:hyperlink r:id="rId299">
+      <w:hyperlink r:id="rId305">
         <w:r>
           <w:rPr>
             <w:rStyle w:val="Hyperlink"/>
@@ -27161,8 +27587,8 @@
         </w:r>
       </w:hyperlink>
     </w:p>
-    <w:bookmarkEnd w:id="300"/>
-    <w:bookmarkStart w:id="302" w:name="ref-strogatz1993"/>
+    <w:bookmarkEnd w:id="306"/>
+    <w:bookmarkStart w:id="308" w:name="ref-strogatz1993"/>
     <w:p>
       <w:pPr>
         <w:pStyle w:val="Bibliography"/>
@@ -27219,7 +27645,7 @@
         </w:rPr>
         <w:t xml:space="preserve"> </w:t>
       </w:r>
-      <w:hyperlink r:id="rId301">
+      <w:hyperlink r:id="rId307">
         <w:r>
           <w:rPr>
             <w:rStyle w:val="Hyperlink"/>
@@ -27229,8 +27655,8 @@
         </w:r>
       </w:hyperlink>
     </w:p>
-    <w:bookmarkEnd w:id="302"/>
-    <w:bookmarkStart w:id="304" w:name="ref-stuart1960"/>
+    <w:bookmarkEnd w:id="308"/>
+    <w:bookmarkStart w:id="310" w:name="ref-stuart1960"/>
     <w:p>
       <w:pPr>
         <w:pStyle w:val="Bibliography"/>
@@ -27287,7 +27713,7 @@
         </w:rPr>
         <w:t xml:space="preserve"> </w:t>
       </w:r>
-      <w:hyperlink r:id="rId303">
+      <w:hyperlink r:id="rId309">
         <w:r>
           <w:rPr>
             <w:rStyle w:val="Hyperlink"/>
@@ -27297,8 +27723,8 @@
         </w:r>
       </w:hyperlink>
     </w:p>
-    <w:bookmarkEnd w:id="304"/>
-    <w:bookmarkStart w:id="306" w:name="ref-tanaka2019"/>
+    <w:bookmarkEnd w:id="310"/>
+    <w:bookmarkStart w:id="312" w:name="ref-tanaka2019"/>
     <w:p>
       <w:pPr>
         <w:pStyle w:val="Bibliography"/>
@@ -27355,7 +27781,7 @@
         </w:rPr>
         <w:t xml:space="preserve"> </w:t>
       </w:r>
-      <w:hyperlink r:id="rId305">
+      <w:hyperlink r:id="rId311">
         <w:r>
           <w:rPr>
             <w:rStyle w:val="Hyperlink"/>
@@ -27365,8 +27791,8 @@
         </w:r>
       </w:hyperlink>
     </w:p>
-    <w:bookmarkEnd w:id="306"/>
-    <w:bookmarkStart w:id="308" w:name="ref-tanaka2011"/>
+    <w:bookmarkEnd w:id="312"/>
+    <w:bookmarkStart w:id="314" w:name="ref-tanaka2011"/>
     <w:p>
       <w:pPr>
         <w:pStyle w:val="Bibliography"/>
@@ -27423,7 +27849,7 @@
         </w:rPr>
         <w:t xml:space="preserve"> </w:t>
       </w:r>
-      <w:hyperlink r:id="rId307">
+      <w:hyperlink r:id="rId313">
         <w:r>
           <w:rPr>
             <w:rStyle w:val="Hyperlink"/>
@@ -27433,8 +27859,8 @@
         </w:r>
       </w:hyperlink>
     </w:p>
-    <w:bookmarkEnd w:id="308"/>
-    <w:bookmarkStart w:id="310" w:name="ref-torrejon2017"/>
+    <w:bookmarkEnd w:id="314"/>
+    <w:bookmarkStart w:id="316" w:name="ref-torrejon2017"/>
     <w:p>
       <w:pPr>
         <w:pStyle w:val="Bibliography"/>
@@ -27491,7 +27917,7 @@
         </w:rPr>
         <w:t xml:space="preserve"> </w:t>
       </w:r>
-      <w:hyperlink r:id="rId309">
+      <w:hyperlink r:id="rId315">
         <w:r>
           <w:rPr>
             <w:rStyle w:val="Hyperlink"/>
@@ -27501,8 +27927,8 @@
         </w:r>
       </w:hyperlink>
     </w:p>
-    <w:bookmarkEnd w:id="310"/>
-    <w:bookmarkStart w:id="312" w:name="ref-turcu2022"/>
+    <w:bookmarkEnd w:id="316"/>
+    <w:bookmarkStart w:id="318" w:name="ref-turcu2022"/>
     <w:p>
       <w:pPr>
         <w:pStyle w:val="Bibliography"/>
@@ -27559,7 +27985,7 @@
         </w:rPr>
         <w:t xml:space="preserve"> </w:t>
       </w:r>
-      <w:hyperlink r:id="rId311">
+      <w:hyperlink r:id="rId317">
         <w:r>
           <w:rPr>
             <w:rStyle w:val="Hyperlink"/>
@@ -27569,8 +27995,8 @@
         </w:r>
       </w:hyperlink>
     </w:p>
-    <w:bookmarkEnd w:id="312"/>
-    <w:bookmarkStart w:id="314" w:name="ref-turian2020"/>
+    <w:bookmarkEnd w:id="318"/>
+    <w:bookmarkStart w:id="320" w:name="ref-turian2020"/>
     <w:p>
       <w:pPr>
         <w:pStyle w:val="Bibliography"/>
@@ -27671,7 +28097,7 @@
         </w:rPr>
         <w:t xml:space="preserve"> </w:t>
       </w:r>
-      <w:hyperlink r:id="rId313">
+      <w:hyperlink r:id="rId319">
         <w:r>
           <w:rPr>
             <w:rStyle w:val="Hyperlink"/>
@@ -27681,8 +28107,8 @@
         </w:r>
       </w:hyperlink>
     </w:p>
-    <w:bookmarkEnd w:id="314"/>
-    <w:bookmarkStart w:id="316" w:name="ref-uhlhaas2006"/>
+    <w:bookmarkEnd w:id="320"/>
+    <w:bookmarkStart w:id="322" w:name="ref-uhlhaas2006"/>
     <w:p>
       <w:pPr>
         <w:pStyle w:val="Bibliography"/>
@@ -27739,7 +28165,7 @@
         </w:rPr>
         <w:t xml:space="preserve"> </w:t>
       </w:r>
-      <w:hyperlink r:id="rId315">
+      <w:hyperlink r:id="rId321">
         <w:r>
           <w:rPr>
             <w:rStyle w:val="Hyperlink"/>
@@ -27749,8 +28175,8 @@
         </w:r>
       </w:hyperlink>
     </w:p>
-    <w:bookmarkEnd w:id="316"/>
-    <w:bookmarkStart w:id="318" w:name="ref-un-0"/>
+    <w:bookmarkEnd w:id="322"/>
+    <w:bookmarkStart w:id="324" w:name="ref-un-0"/>
     <w:p>
       <w:pPr>
         <w:pStyle w:val="Bibliography"/>
@@ -27811,7 +28237,7 @@
         </w:rPr>
         <w:t xml:space="preserve"> </w:t>
       </w:r>
-      <w:hyperlink r:id="rId317">
+      <w:hyperlink r:id="rId323">
         <w:r>
           <w:rPr>
             <w:rStyle w:val="Hyperlink"/>
@@ -27821,8 +28247,8 @@
         </w:r>
       </w:hyperlink>
     </w:p>
-    <w:bookmarkEnd w:id="318"/>
-    <w:bookmarkStart w:id="320" w:name="ref-sparsity-study"/>
+    <w:bookmarkEnd w:id="324"/>
+    <w:bookmarkStart w:id="326" w:name="ref-sparsity-study"/>
     <w:p>
       <w:pPr>
         <w:pStyle w:val="Bibliography"/>
@@ -27859,7 +28285,7 @@
         </w:rPr>
         <w:t xml:space="preserve"> </w:t>
       </w:r>
-      <w:hyperlink r:id="rId319">
+      <w:hyperlink r:id="rId325">
         <w:r>
           <w:rPr>
             <w:rStyle w:val="Hyperlink"/>
@@ -27869,8 +28295,8 @@
         </w:r>
       </w:hyperlink>
     </w:p>
-    <w:bookmarkEnd w:id="320"/>
-    <w:bookmarkStart w:id="322" w:name="ref-mit-code"/>
+    <w:bookmarkEnd w:id="326"/>
+    <w:bookmarkStart w:id="328" w:name="ref-mit-code"/>
     <w:p>
       <w:pPr>
         <w:pStyle w:val="Bibliography"/>
@@ -27915,7 +28341,7 @@
         </w:rPr>
         <w:t xml:space="preserve"> </w:t>
       </w:r>
-      <w:hyperlink r:id="rId321">
+      <w:hyperlink r:id="rId327">
         <w:r>
           <w:rPr>
             <w:rStyle w:val="Hyperlink"/>
@@ -27925,8 +28351,8 @@
         </w:r>
       </w:hyperlink>
     </w:p>
-    <w:bookmarkEnd w:id="322"/>
-    <w:bookmarkStart w:id="324" w:name="ref-vanderpol1926"/>
+    <w:bookmarkEnd w:id="328"/>
+    <w:bookmarkStart w:id="330" w:name="ref-vanderpol1926"/>
     <w:p>
       <w:pPr>
         <w:pStyle w:val="Bibliography"/>
@@ -27983,7 +28409,7 @@
         </w:rPr>
         <w:t xml:space="preserve"> </w:t>
       </w:r>
-      <w:hyperlink r:id="rId323">
+      <w:hyperlink r:id="rId329">
         <w:r>
           <w:rPr>
             <w:rStyle w:val="Hyperlink"/>
@@ -27993,8 +28419,8 @@
         </w:r>
       </w:hyperlink>
     </w:p>
-    <w:bookmarkEnd w:id="324"/>
-    <w:bookmarkStart w:id="326" w:name="ref-vaswani2017"/>
+    <w:bookmarkEnd w:id="330"/>
+    <w:bookmarkStart w:id="332" w:name="ref-vaswani2017"/>
     <w:p>
       <w:pPr>
         <w:pStyle w:val="Bibliography"/>
@@ -28063,7 +28489,7 @@
         </w:rPr>
         <w:t xml:space="preserve"> </w:t>
       </w:r>
-      <w:hyperlink r:id="rId325">
+      <w:hyperlink r:id="rId331">
         <w:r>
           <w:rPr>
             <w:rStyle w:val="Hyperlink"/>
@@ -28073,8 +28499,8 @@
         </w:r>
       </w:hyperlink>
     </w:p>
-    <w:bookmarkEnd w:id="326"/>
-    <w:bookmarkStart w:id="328" w:name="ref-spikevoice"/>
+    <w:bookmarkEnd w:id="332"/>
+    <w:bookmarkStart w:id="334" w:name="ref-spikevoice"/>
     <w:p>
       <w:pPr>
         <w:pStyle w:val="Bibliography"/>
@@ -28111,7 +28537,7 @@
         </w:rPr>
         <w:t xml:space="preserve"> </w:t>
       </w:r>
-      <w:hyperlink r:id="rId327">
+      <w:hyperlink r:id="rId333">
         <w:r>
           <w:rPr>
             <w:rStyle w:val="Hyperlink"/>
@@ -28121,8 +28547,8 @@
         </w:r>
       </w:hyperlink>
     </w:p>
-    <w:bookmarkEnd w:id="328"/>
-    <w:bookmarkStart w:id="330" w:name="ref-oscillator-ising-machines"/>
+    <w:bookmarkEnd w:id="334"/>
+    <w:bookmarkStart w:id="336" w:name="ref-oscillator-ising-machines"/>
     <w:p>
       <w:pPr>
         <w:pStyle w:val="Bibliography"/>
@@ -28159,7 +28585,7 @@
         </w:rPr>
         <w:t xml:space="preserve"> </w:t>
       </w:r>
-      <w:hyperlink r:id="rId329">
+      <w:hyperlink r:id="rId335">
         <w:r>
           <w:rPr>
             <w:rStyle w:val="Hyperlink"/>
@@ -28169,8 +28595,8 @@
         </w:r>
       </w:hyperlink>
     </w:p>
-    <w:bookmarkEnd w:id="330"/>
-    <w:bookmarkStart w:id="332" w:name="ref-winfree1967"/>
+    <w:bookmarkEnd w:id="336"/>
+    <w:bookmarkStart w:id="338" w:name="ref-winfree1967"/>
     <w:p>
       <w:pPr>
         <w:pStyle w:val="Bibliography"/>
@@ -28227,7 +28653,7 @@
         </w:rPr>
         <w:t xml:space="preserve"> </w:t>
       </w:r>
-      <w:hyperlink r:id="rId331">
+      <w:hyperlink r:id="rId337">
         <w:r>
           <w:rPr>
             <w:rStyle w:val="Hyperlink"/>
@@ -28237,8 +28663,8 @@
         </w:r>
       </w:hyperlink>
     </w:p>
-    <w:bookmarkEnd w:id="332"/>
-    <w:bookmarkStart w:id="334" w:name="ref-kope"/>
+    <w:bookmarkEnd w:id="338"/>
+    <w:bookmarkStart w:id="340" w:name="ref-kope"/>
     <w:p>
       <w:pPr>
         <w:pStyle w:val="Bibliography"/>
@@ -28307,7 +28733,7 @@
         </w:rPr>
         <w:t xml:space="preserve"> </w:t>
       </w:r>
-      <w:hyperlink r:id="rId333">
+      <w:hyperlink r:id="rId339">
         <w:r>
           <w:rPr>
             <w:rStyle w:val="Hyperlink"/>
@@ -28317,8 +28743,8 @@
         </w:r>
       </w:hyperlink>
     </w:p>
-    <w:bookmarkEnd w:id="334"/>
-    <w:bookmarkStart w:id="336" w:name="ref-yeung1999"/>
+    <w:bookmarkEnd w:id="340"/>
+    <w:bookmarkStart w:id="342" w:name="ref-yeung1999"/>
     <w:p>
       <w:pPr>
         <w:pStyle w:val="Bibliography"/>
@@ -28375,7 +28801,7 @@
         </w:rPr>
         <w:t xml:space="preserve"> </w:t>
       </w:r>
-      <w:hyperlink r:id="rId335">
+      <w:hyperlink r:id="rId341">
         <w:r>
           <w:rPr>
             <w:rStyle w:val="Hyperlink"/>
@@ -28385,8 +28811,8 @@
         </w:r>
       </w:hyperlink>
     </w:p>
-    <w:bookmarkEnd w:id="336"/>
-    <w:bookmarkStart w:id="338" w:name="ref-yu2025"/>
+    <w:bookmarkEnd w:id="342"/>
+    <w:bookmarkStart w:id="344" w:name="ref-yu2025"/>
     <w:p>
       <w:pPr>
         <w:pStyle w:val="Bibliography"/>
@@ -28455,7 +28881,7 @@
         </w:rPr>
         <w:t xml:space="preserve"> </w:t>
       </w:r>
-      <w:hyperlink r:id="rId337">
+      <w:hyperlink r:id="rId343">
         <w:r>
           <w:rPr>
             <w:rStyle w:val="Hyperlink"/>
@@ -28465,8 +28891,8 @@
         </w:r>
       </w:hyperlink>
     </w:p>
-    <w:bookmarkEnd w:id="338"/>
-    <w:bookmarkStart w:id="340" w:name="ref-zhang2026"/>
+    <w:bookmarkEnd w:id="344"/>
+    <w:bookmarkStart w:id="346" w:name="ref-zhang2026"/>
     <w:p>
       <w:pPr>
         <w:pStyle w:val="Bibliography"/>
@@ -28591,7 +29017,7 @@
         </w:rPr>
         <w:t xml:space="preserve"> </w:t>
       </w:r>
-      <w:hyperlink r:id="rId339">
+      <w:hyperlink r:id="rId345">
         <w:r>
           <w:rPr>
             <w:rStyle w:val="Hyperlink"/>
@@ -28601,8 +29027,8 @@
         </w:r>
       </w:hyperlink>
     </w:p>
-    <w:bookmarkEnd w:id="340"/>
-    <w:bookmarkStart w:id="342" w:name="ref-ada-fe"/>
+    <w:bookmarkEnd w:id="346"/>
+    <w:bookmarkStart w:id="348" w:name="ref-ada-fe"/>
     <w:p>
       <w:pPr>
         <w:pStyle w:val="Bibliography"/>
@@ -28639,7 +29065,7 @@
         </w:rPr>
         <w:t xml:space="preserve"> </w:t>
       </w:r>
-      <w:hyperlink r:id="rId341">
+      <w:hyperlink r:id="rId347">
         <w:r>
           <w:rPr>
             <w:rStyle w:val="Hyperlink"/>
@@ -28649,8 +29075,8 @@
         </w:r>
       </w:hyperlink>
     </w:p>
-    <w:bookmarkEnd w:id="342"/>
-    <w:bookmarkStart w:id="344" w:name="ref-zhang2023"/>
+    <w:bookmarkEnd w:id="348"/>
+    <w:bookmarkStart w:id="350" w:name="ref-zhang2023"/>
     <w:p>
       <w:pPr>
         <w:pStyle w:val="Bibliography"/>
@@ -28707,7 +29133,7 @@
         </w:rPr>
         <w:t xml:space="preserve"> </w:t>
       </w:r>
-      <w:hyperlink r:id="rId343">
+      <w:hyperlink r:id="rId349">
         <w:r>
           <w:rPr>
             <w:rStyle w:val="Hyperlink"/>
@@ -28717,8 +29143,8 @@
         </w:r>
       </w:hyperlink>
     </w:p>
-    <w:bookmarkEnd w:id="344"/>
-    <w:bookmarkStart w:id="346" w:name="ref-gdd"/>
+    <w:bookmarkEnd w:id="350"/>
+    <w:bookmarkStart w:id="352" w:name="ref-gdd"/>
     <w:p>
       <w:pPr>
         <w:pStyle w:val="Bibliography"/>
@@ -28755,7 +29181,7 @@
         </w:rPr>
         <w:t xml:space="preserve"> </w:t>
       </w:r>
-      <w:hyperlink r:id="rId345">
+      <w:hyperlink r:id="rId351">
         <w:r>
           <w:rPr>
             <w:rStyle w:val="Hyperlink"/>
@@ -28765,9 +29191,9 @@
         </w:r>
       </w:hyperlink>
     </w:p>
-    <w:bookmarkEnd w:id="346"/>
-    <w:bookmarkEnd w:id="347"/>
-    <w:bookmarkEnd w:id="348"/>
+    <w:bookmarkEnd w:id="352"/>
+    <w:bookmarkEnd w:id="353"/>
+    <w:bookmarkEnd w:id="354"/>
     <w:sectPr>
       <w:footnotePr>
         <w:numRestart w:val="eachSect"/>

</xml_diff>